<commit_message>
fuel type changed to product type
</commit_message>
<xml_diff>
--- a/docs/user-guide.docx
+++ b/docs/user-guide.docx
@@ -83,7 +83,7 @@
           <w:sz w:val="20"/>
           <w:szCs w:val="20"/>
         </w:rPr>
-        <w:t xml:space="preserve">Version 1.0  ·  12 July 2026</w:t>
+        <w:t xml:space="preserve">Version 1.0  ·  13 July 2026</w:t>
       </w:r>
     </w:p>
     <w:p>
@@ -312,7 +312,7 @@
           <w:sz w:val="22"/>
           <w:szCs w:val="22"/>
         </w:rPr>
-        <w:t xml:space="preserve">[Fuel Management — Pumps, Tanks &amp; Pricing](#9-fuel-management--pumps-tanks--pricing)</w:t>
+        <w:t xml:space="preserve">[Product Management — Pumps, Tanks &amp; Pricing](#9-product-management--pumps-tanks--pricing)</w:t>
       </w:r>
     </w:p>
     <w:p>
@@ -6191,7 +6191,7 @@
           <w:sz w:val="32"/>
           <w:szCs w:val="32"/>
         </w:rPr>
-        <w:t xml:space="preserve">9. Fuel Management — Pumps, Tanks &amp; Pricing</w:t>
+        <w:t xml:space="preserve">9. Product Management — Pumps, Tanks &amp; Pricing</w:t>
       </w:r>
     </w:p>
     <w:p>
@@ -6257,7 +6257,7 @@
           <w:sz w:val="22"/>
           <w:szCs w:val="22"/>
         </w:rPr>
-        <w:t xml:space="preserve">Fuel Management</w:t>
+        <w:t xml:space="preserve">Product Management</w:t>
       </w:r>
       <w:r>
         <w:rPr>
@@ -6486,7 +6486,7 @@
           <w:sz w:val="22"/>
           <w:szCs w:val="22"/>
         </w:rPr>
-        <w:t xml:space="preserve">Fuel Management</w:t>
+        <w:t xml:space="preserve">Product Management</w:t>
       </w:r>
       <w:r>
         <w:rPr>
@@ -6613,7 +6613,7 @@
           <w:sz w:val="22"/>
           <w:szCs w:val="22"/>
         </w:rPr>
-        <w:t xml:space="preserve">Fuel Management</w:t>
+        <w:t xml:space="preserve">Product Management</w:t>
       </w:r>
       <w:r>
         <w:rPr>
@@ -6809,7 +6809,7 @@
           <w:sz w:val="22"/>
           <w:szCs w:val="22"/>
         </w:rPr>
-        <w:t xml:space="preserve">Fuel Management</w:t>
+        <w:t xml:space="preserve">Product Management</w:t>
       </w:r>
       <w:r>
         <w:rPr>
@@ -7210,7 +7210,7 @@
           <w:sz w:val="22"/>
           <w:szCs w:val="22"/>
         </w:rPr>
-        <w:t xml:space="preserve">Fuel Management</w:t>
+        <w:t xml:space="preserve">Product Management</w:t>
       </w:r>
       <w:r>
         <w:rPr>
@@ -7527,7 +7527,7 @@
           <w:sz w:val="26"/>
           <w:szCs w:val="26"/>
         </w:rPr>
-        <w:t xml:space="preserve">9.7 Fuel Deliveries — Scheduling &amp; Receiving</w:t>
+        <w:t xml:space="preserve">9.7 Product Deliveries — Scheduling &amp; Receiving</w:t>
       </w:r>
     </w:p>
     <w:p>
@@ -7548,7 +7548,7 @@
           <w:sz w:val="22"/>
           <w:szCs w:val="22"/>
         </w:rPr>
-        <w:t xml:space="preserve">Done by the Manager</w:t>
+        <w:t xml:space="preserve">Done by the Manager. Find it under **Product Management** &gt; **Order &amp; Deliveries**.</w:t>
       </w:r>
     </w:p>
     <w:p>
@@ -7563,7 +7563,7 @@
           <w:sz w:val="22"/>
           <w:szCs w:val="22"/>
         </w:rPr>
-        <w:t xml:space="preserve">Scheduling a delivery:</w:t>
+        <w:t xml:space="preserve">Scheduling a delivery (one purchase can fill several tanks):</w:t>
       </w:r>
     </w:p>
     <w:p>
@@ -7591,7 +7591,7 @@
           <w:sz w:val="22"/>
           <w:szCs w:val="22"/>
         </w:rPr>
-        <w:t xml:space="preserve">Fuel Management</w:t>
+        <w:t xml:space="preserve">Product Management</w:t>
       </w:r>
       <w:r>
         <w:rPr>
@@ -7611,23 +7611,13 @@
         </w:rPr>
         <w:t xml:space="preserve">Order &amp; Deliveries</w:t>
       </w:r>
-    </w:p>
-    <w:p>
-      <w:pPr>
-        <w:pStyle w:val="ListParagraph"/>
-        <w:numPr>
-          <w:ilvl w:val="0"/>
-          <w:numId w:val="2"/>
-        </w:numPr>
-        <w:spacing w:after="60" w:before="0" w:line="276"/>
-      </w:pPr>
-      <w:r>
-        <w:rPr>
-          <w:rFonts w:ascii="Calibri" w:cs="Calibri" w:eastAsia="Calibri" w:hAnsi="Calibri"/>
-          <w:sz w:val="22"/>
-          <w:szCs w:val="22"/>
-        </w:rPr>
-        <w:t xml:space="preserve">Click </w:t>
+      <w:r>
+        <w:rPr>
+          <w:rFonts w:ascii="Calibri" w:cs="Calibri" w:eastAsia="Calibri" w:hAnsi="Calibri"/>
+          <w:sz w:val="22"/>
+          <w:szCs w:val="22"/>
+        </w:rPr>
+        <w:t xml:space="preserve"> and click </w:t>
       </w:r>
       <w:r>
         <w:rPr>
@@ -7639,31 +7629,195 @@
         </w:rPr>
         <w:t xml:space="preserve">Schedule Delivery</w:t>
       </w:r>
-      <w:r>
-        <w:rPr>
-          <w:rFonts w:ascii="Calibri" w:cs="Calibri" w:eastAsia="Calibri" w:hAnsi="Calibri"/>
-          <w:sz w:val="22"/>
-          <w:szCs w:val="22"/>
-        </w:rPr>
-        <w:t xml:space="preserve">, choose the tank, supplier, price per litre and the </w:t>
-      </w:r>
-      <w:r>
-        <w:rPr>
-          <w:rFonts w:ascii="Calibri" w:cs="Calibri" w:eastAsia="Calibri" w:hAnsi="Calibri"/>
-          <w:b/>
-          <w:bCs/>
-          <w:sz w:val="22"/>
-          <w:szCs w:val="22"/>
-        </w:rPr>
-        <w:t xml:space="preserve">quantity ordered</w:t>
-      </w:r>
-      <w:r>
-        <w:rPr>
-          <w:rFonts w:ascii="Calibri" w:cs="Calibri" w:eastAsia="Calibri" w:hAnsi="Calibri"/>
-          <w:sz w:val="22"/>
-          <w:szCs w:val="22"/>
-        </w:rPr>
-        <w:t xml:space="preserve">, then save</w:t>
+    </w:p>
+    <w:p>
+      <w:pPr>
+        <w:pStyle w:val="ListParagraph"/>
+        <w:numPr>
+          <w:ilvl w:val="0"/>
+          <w:numId w:val="2"/>
+        </w:numPr>
+        <w:spacing w:after="60" w:before="0" w:line="276"/>
+      </w:pPr>
+      <w:r>
+        <w:rPr>
+          <w:rFonts w:ascii="Calibri" w:cs="Calibri" w:eastAsia="Calibri" w:hAnsi="Calibri"/>
+          <w:sz w:val="22"/>
+          <w:szCs w:val="22"/>
+        </w:rPr>
+        <w:t xml:space="preserve">Choose the </w:t>
+      </w:r>
+      <w:r>
+        <w:rPr>
+          <w:rFonts w:ascii="Calibri" w:cs="Calibri" w:eastAsia="Calibri" w:hAnsi="Calibri"/>
+          <w:b/>
+          <w:bCs/>
+          <w:sz w:val="22"/>
+          <w:szCs w:val="22"/>
+        </w:rPr>
+        <w:t xml:space="preserve">Product</w:t>
+      </w:r>
+      <w:r>
+        <w:rPr>
+          <w:rFonts w:ascii="Calibri" w:cs="Calibri" w:eastAsia="Calibri" w:hAnsi="Calibri"/>
+          <w:sz w:val="22"/>
+          <w:szCs w:val="22"/>
+        </w:rPr>
+        <w:t xml:space="preserve"> (PMS, AGO/Diesel, DPK/Kerosene…)</w:t>
+      </w:r>
+    </w:p>
+    <w:p>
+      <w:pPr>
+        <w:pStyle w:val="ListParagraph"/>
+        <w:numPr>
+          <w:ilvl w:val="0"/>
+          <w:numId w:val="2"/>
+        </w:numPr>
+        <w:spacing w:after="60" w:before="0" w:line="276"/>
+      </w:pPr>
+      <w:r>
+        <w:rPr>
+          <w:rFonts w:ascii="Calibri" w:cs="Calibri" w:eastAsia="Calibri" w:hAnsi="Calibri"/>
+          <w:sz w:val="22"/>
+          <w:szCs w:val="22"/>
+        </w:rPr>
+        <w:t xml:space="preserve">Under </w:t>
+      </w:r>
+      <w:r>
+        <w:rPr>
+          <w:rFonts w:ascii="Calibri" w:cs="Calibri" w:eastAsia="Calibri" w:hAnsi="Calibri"/>
+          <w:b/>
+          <w:bCs/>
+          <w:sz w:val="22"/>
+          <w:szCs w:val="22"/>
+        </w:rPr>
+        <w:t xml:space="preserve">Fill Tanks</w:t>
+      </w:r>
+      <w:r>
+        <w:rPr>
+          <w:rFonts w:ascii="Calibri" w:cs="Calibri" w:eastAsia="Calibri" w:hAnsi="Calibri"/>
+          <w:sz w:val="22"/>
+          <w:szCs w:val="22"/>
+        </w:rPr>
+        <w:t xml:space="preserve">, pick a tank and the litres going into it. If the load is split across more than one tank of the same product — e.g. a </w:t>
+      </w:r>
+      <w:r>
+        <w:rPr>
+          <w:rFonts w:ascii="Calibri" w:cs="Calibri" w:eastAsia="Calibri" w:hAnsi="Calibri"/>
+          <w:b/>
+          <w:bCs/>
+          <w:sz w:val="22"/>
+          <w:szCs w:val="22"/>
+        </w:rPr>
+        <w:t xml:space="preserve">30,000 L PMS load</w:t>
+      </w:r>
+      <w:r>
+        <w:rPr>
+          <w:rFonts w:ascii="Calibri" w:cs="Calibri" w:eastAsia="Calibri" w:hAnsi="Calibri"/>
+          <w:sz w:val="22"/>
+          <w:szCs w:val="22"/>
+        </w:rPr>
+        <w:t xml:space="preserve"> poured into three PMS tanks as 12,000 + 10,000 + 8,000 — click </w:t>
+      </w:r>
+      <w:r>
+        <w:rPr>
+          <w:rFonts w:ascii="Calibri" w:cs="Calibri" w:eastAsia="Calibri" w:hAnsi="Calibri"/>
+          <w:b/>
+          <w:bCs/>
+          <w:sz w:val="22"/>
+          <w:szCs w:val="22"/>
+        </w:rPr>
+        <w:t xml:space="preserve">Add another tank</w:t>
+      </w:r>
+      <w:r>
+        <w:rPr>
+          <w:rFonts w:ascii="Calibri" w:cs="Calibri" w:eastAsia="Calibri" w:hAnsi="Calibri"/>
+          <w:sz w:val="22"/>
+          <w:szCs w:val="22"/>
+        </w:rPr>
+        <w:t xml:space="preserve"> and enter each allocation. The running total is shown as you go</w:t>
+      </w:r>
+    </w:p>
+    <w:p>
+      <w:pPr>
+        <w:pStyle w:val="ListParagraph"/>
+        <w:numPr>
+          <w:ilvl w:val="0"/>
+          <w:numId w:val="2"/>
+        </w:numPr>
+        <w:spacing w:after="60" w:before="0" w:line="276"/>
+      </w:pPr>
+      <w:r>
+        <w:rPr>
+          <w:rFonts w:ascii="Calibri" w:cs="Calibri" w:eastAsia="Calibri" w:hAnsi="Calibri"/>
+          <w:sz w:val="22"/>
+          <w:szCs w:val="22"/>
+        </w:rPr>
+        <w:t xml:space="preserve">Enter the </w:t>
+      </w:r>
+      <w:r>
+        <w:rPr>
+          <w:rFonts w:ascii="Calibri" w:cs="Calibri" w:eastAsia="Calibri" w:hAnsi="Calibri"/>
+          <w:b/>
+          <w:bCs/>
+          <w:sz w:val="22"/>
+          <w:szCs w:val="22"/>
+        </w:rPr>
+        <w:t xml:space="preserve">price per litre</w:t>
+      </w:r>
+      <w:r>
+        <w:rPr>
+          <w:rFonts w:ascii="Calibri" w:cs="Calibri" w:eastAsia="Calibri" w:hAnsi="Calibri"/>
+          <w:sz w:val="22"/>
+          <w:szCs w:val="22"/>
+        </w:rPr>
+        <w:t xml:space="preserve">, </w:t>
+      </w:r>
+      <w:r>
+        <w:rPr>
+          <w:rFonts w:ascii="Calibri" w:cs="Calibri" w:eastAsia="Calibri" w:hAnsi="Calibri"/>
+          <w:b/>
+          <w:bCs/>
+          <w:sz w:val="22"/>
+          <w:szCs w:val="22"/>
+        </w:rPr>
+        <w:t xml:space="preserve">supplier</w:t>
+      </w:r>
+      <w:r>
+        <w:rPr>
+          <w:rFonts w:ascii="Calibri" w:cs="Calibri" w:eastAsia="Calibri" w:hAnsi="Calibri"/>
+          <w:sz w:val="22"/>
+          <w:szCs w:val="22"/>
+        </w:rPr>
+        <w:t xml:space="preserve"> and </w:t>
+      </w:r>
+      <w:r>
+        <w:rPr>
+          <w:rFonts w:ascii="Calibri" w:cs="Calibri" w:eastAsia="Calibri" w:hAnsi="Calibri"/>
+          <w:b/>
+          <w:bCs/>
+          <w:sz w:val="22"/>
+          <w:szCs w:val="22"/>
+        </w:rPr>
+        <w:t xml:space="preserve">delivery date</w:t>
+      </w:r>
+      <w:r>
+        <w:rPr>
+          <w:rFonts w:ascii="Calibri" w:cs="Calibri" w:eastAsia="Calibri" w:hAnsi="Calibri"/>
+          <w:sz w:val="22"/>
+          <w:szCs w:val="22"/>
+        </w:rPr>
+        <w:t xml:space="preserve">, then click </w:t>
+      </w:r>
+      <w:r>
+        <w:rPr>
+          <w:rFonts w:ascii="Calibri" w:cs="Calibri" w:eastAsia="Calibri" w:hAnsi="Calibri"/>
+          <w:b/>
+          <w:bCs/>
+          <w:sz w:val="22"/>
+          <w:szCs w:val="22"/>
+        </w:rPr>
+        <w:t xml:space="preserve">Schedule Delivery</w:t>
       </w:r>
     </w:p>
     <w:p>
@@ -7673,184 +7827,46 @@
       <w:r>
         <w:rPr>
           <w:rFonts w:ascii="Calibri" w:cs="Calibri" w:eastAsia="Calibri" w:hAnsi="Calibri"/>
-          <w:b/>
-          <w:bCs/>
-          <w:sz w:val="22"/>
-          <w:szCs w:val="22"/>
-        </w:rPr>
-        <w:t xml:space="preserve">Receiving a delivery (when the tanker arrives):</w:t>
-      </w:r>
-    </w:p>
-    <w:p>
-      <w:pPr>
-        <w:pStyle w:val="ListParagraph"/>
-        <w:numPr>
-          <w:ilvl w:val="0"/>
-          <w:numId w:val="2"/>
-        </w:numPr>
-        <w:spacing w:after="60" w:before="0" w:line="276"/>
-      </w:pPr>
-      <w:r>
-        <w:rPr>
-          <w:rFonts w:ascii="Calibri" w:cs="Calibri" w:eastAsia="Calibri" w:hAnsi="Calibri"/>
-          <w:sz w:val="22"/>
-          <w:szCs w:val="22"/>
-        </w:rPr>
-        <w:t xml:space="preserve">Find the delivery in the list and click </w:t>
-      </w:r>
-      <w:r>
-        <w:rPr>
-          <w:rFonts w:ascii="Calibri" w:cs="Calibri" w:eastAsia="Calibri" w:hAnsi="Calibri"/>
-          <w:b/>
-          <w:bCs/>
-          <w:sz w:val="22"/>
-          <w:szCs w:val="22"/>
-        </w:rPr>
-        <w:t xml:space="preserve">Mark as Completed</w:t>
-      </w:r>
-    </w:p>
-    <w:p>
-      <w:pPr>
-        <w:pStyle w:val="ListParagraph"/>
-        <w:numPr>
-          <w:ilvl w:val="0"/>
-          <w:numId w:val="2"/>
-        </w:numPr>
-        <w:spacing w:after="60" w:before="0" w:line="276"/>
-      </w:pPr>
-      <w:r>
-        <w:rPr>
-          <w:rFonts w:ascii="Calibri" w:cs="Calibri" w:eastAsia="Calibri" w:hAnsi="Calibri"/>
-          <w:sz w:val="22"/>
-          <w:szCs w:val="22"/>
-        </w:rPr>
-        <w:t xml:space="preserve">A </w:t>
-      </w:r>
-      <w:r>
-        <w:rPr>
-          <w:rFonts w:ascii="Calibri" w:cs="Calibri" w:eastAsia="Calibri" w:hAnsi="Calibri"/>
-          <w:b/>
-          <w:bCs/>
-          <w:sz w:val="22"/>
-          <w:szCs w:val="22"/>
-        </w:rPr>
-        <w:t xml:space="preserve">Receive Delivery</w:t>
-      </w:r>
-      <w:r>
-        <w:rPr>
-          <w:rFonts w:ascii="Calibri" w:cs="Calibri" w:eastAsia="Calibri" w:hAnsi="Calibri"/>
-          <w:sz w:val="22"/>
-          <w:szCs w:val="22"/>
-        </w:rPr>
-        <w:t xml:space="preserve"> dialog opens showing what was ordered — enter the </w:t>
-      </w:r>
-      <w:r>
-        <w:rPr>
-          <w:rFonts w:ascii="Calibri" w:cs="Calibri" w:eastAsia="Calibri" w:hAnsi="Calibri"/>
-          <w:b/>
-          <w:bCs/>
-          <w:sz w:val="22"/>
-          <w:szCs w:val="22"/>
-        </w:rPr>
-        <w:t xml:space="preserve">actual litres the tanker discharged</w:t>
-      </w:r>
-      <w:r>
-        <w:rPr>
-          <w:rFonts w:ascii="Calibri" w:cs="Calibri" w:eastAsia="Calibri" w:hAnsi="Calibri"/>
-          <w:sz w:val="22"/>
-          <w:szCs w:val="22"/>
-        </w:rPr>
-        <w:t xml:space="preserve"> (pre-filled with the ordered amount)</w:t>
-      </w:r>
-    </w:p>
-    <w:p>
-      <w:pPr>
-        <w:pStyle w:val="ListParagraph"/>
-        <w:numPr>
-          <w:ilvl w:val="0"/>
-          <w:numId w:val="2"/>
-        </w:numPr>
-        <w:spacing w:after="60" w:before="0" w:line="276"/>
-      </w:pPr>
-      <w:r>
-        <w:rPr>
-          <w:rFonts w:ascii="Calibri" w:cs="Calibri" w:eastAsia="Calibri" w:hAnsi="Calibri"/>
-          <w:sz w:val="22"/>
-          <w:szCs w:val="22"/>
-        </w:rPr>
-        <w:t xml:space="preserve">If the figure differs from the order, the dialog immediately shows a </w:t>
-      </w:r>
-      <w:r>
-        <w:rPr>
-          <w:rFonts w:ascii="Calibri" w:cs="Calibri" w:eastAsia="Calibri" w:hAnsi="Calibri"/>
-          <w:b/>
-          <w:bCs/>
-          <w:sz w:val="22"/>
-          <w:szCs w:val="22"/>
-        </w:rPr>
-        <w:t xml:space="preserve">short delivery</w:t>
-      </w:r>
-      <w:r>
-        <w:rPr>
-          <w:rFonts w:ascii="Calibri" w:cs="Calibri" w:eastAsia="Calibri" w:hAnsi="Calibri"/>
-          <w:sz w:val="22"/>
-          <w:szCs w:val="22"/>
-        </w:rPr>
-        <w:t xml:space="preserve"> or </w:t>
-      </w:r>
-      <w:r>
-        <w:rPr>
-          <w:rFonts w:ascii="Calibri" w:cs="Calibri" w:eastAsia="Calibri" w:hAnsi="Calibri"/>
-          <w:b/>
-          <w:bCs/>
-          <w:sz w:val="22"/>
-          <w:szCs w:val="22"/>
-        </w:rPr>
-        <w:t xml:space="preserve">over delivery</w:t>
-      </w:r>
-      <w:r>
-        <w:rPr>
-          <w:rFonts w:ascii="Calibri" w:cs="Calibri" w:eastAsia="Calibri" w:hAnsi="Calibri"/>
-          <w:sz w:val="22"/>
-          <w:szCs w:val="22"/>
-        </w:rPr>
-        <w:t xml:space="preserve"> warning so you can see the gap before confirming</w:t>
-      </w:r>
-    </w:p>
-    <w:p>
-      <w:pPr>
-        <w:pStyle w:val="ListParagraph"/>
-        <w:numPr>
-          <w:ilvl w:val="0"/>
-          <w:numId w:val="2"/>
-        </w:numPr>
-        <w:spacing w:after="60" w:before="0" w:line="276"/>
-      </w:pPr>
-      <w:r>
-        <w:rPr>
-          <w:rFonts w:ascii="Calibri" w:cs="Calibri" w:eastAsia="Calibri" w:hAnsi="Calibri"/>
-          <w:sz w:val="22"/>
-          <w:szCs w:val="22"/>
-        </w:rPr>
-        <w:t xml:space="preserve">Click </w:t>
-      </w:r>
-      <w:r>
-        <w:rPr>
-          <w:rFonts w:ascii="Calibri" w:cs="Calibri" w:eastAsia="Calibri" w:hAnsi="Calibri"/>
-          <w:b/>
-          <w:bCs/>
-          <w:sz w:val="22"/>
-          <w:szCs w:val="22"/>
-        </w:rPr>
-        <w:t xml:space="preserve">Confirm &amp; Fill Tank</w:t>
-      </w:r>
-      <w:r>
-        <w:rPr>
-          <w:rFonts w:ascii="Calibri" w:cs="Calibri" w:eastAsia="Calibri" w:hAnsi="Calibri"/>
-          <w:sz w:val="22"/>
-          <w:szCs w:val="22"/>
-        </w:rPr>
-        <w:t xml:space="preserve"> — the tank is filled with the *actual* litres received</w:t>
+          <w:sz w:val="22"/>
+          <w:szCs w:val="22"/>
+        </w:rPr>
+        <w:t xml:space="preserve">All the tank allocations are saved as </w:t>
+      </w:r>
+      <w:r>
+        <w:rPr>
+          <w:rFonts w:ascii="Calibri" w:cs="Calibri" w:eastAsia="Calibri" w:hAnsi="Calibri"/>
+          <w:b/>
+          <w:bCs/>
+          <w:sz w:val="22"/>
+          <w:szCs w:val="22"/>
+        </w:rPr>
+        <w:t xml:space="preserve">one purchase</w:t>
+      </w:r>
+      <w:r>
+        <w:rPr>
+          <w:rFonts w:ascii="Calibri" w:cs="Calibri" w:eastAsia="Calibri" w:hAnsi="Calibri"/>
+          <w:sz w:val="22"/>
+          <w:szCs w:val="22"/>
+        </w:rPr>
+        <w:t xml:space="preserve"> under a shared reference (e.g. </w:t>
+      </w:r>
+      <w:r>
+        <w:rPr>
+          <w:rFonts w:ascii="Courier New" w:cs="Courier New" w:eastAsia="Courier New" w:hAnsi="Courier New"/>
+          <w:color w:val="C7254E"/>
+          <w:sz w:val="22"/>
+          <w:szCs w:val="22"/>
+          <w:shd w:fill="F9F2F4" w:val="clear"/>
+        </w:rPr>
+        <w:t xml:space="preserve">FDL-2026-001</w:t>
+      </w:r>
+      <w:r>
+        <w:rPr>
+          <w:rFonts w:ascii="Calibri" w:cs="Calibri" w:eastAsia="Calibri" w:hAnsi="Calibri"/>
+          <w:sz w:val="22"/>
+          <w:szCs w:val="22"/>
+        </w:rPr>
+        <w:t xml:space="preserve">), so the supplier's single invoice matches the whole load — while each tank still tracks its own exact stock. Each tank line is received individually as the tanker discharges into it.</w:t>
       </w:r>
     </w:p>
     <w:p>
@@ -7871,7 +7887,215 @@
           <w:sz w:val="22"/>
           <w:szCs w:val="22"/>
         </w:rPr>
-        <w:t xml:space="preserve">The ordered quantity stays frozen on the record, so any shortfall automatically surfaces when your accountant matches the supplier's invoice (see Section 12). The accountant is also notified the moment a delivery is completed.</w:t>
+        <w:t xml:space="preserve">**Capacity is respected.** Each tank in the list shows how much **free space** it has (limit minus what's already in it). If Tank A holds 10,000 L and its limit is 22,000 L, it can only take **12,000 L more** — the form shows this, offers a "Fill to capacity" shortcut, and blocks you from over-filling it. You simply put the remaining litres into your other tanks of the same product. If your total free space is less than the load, you cannot store it all until some is sold down first.</w:t>
+      </w:r>
+    </w:p>
+    <w:p>
+      <w:pPr>
+        <w:spacing w:after="100" w:before="0" w:line="276"/>
+      </w:pPr>
+      <w:r>
+        <w:rPr>
+          <w:rFonts w:ascii="Calibri" w:cs="Calibri" w:eastAsia="Calibri" w:hAnsi="Calibri"/>
+          <w:b/>
+          <w:bCs/>
+          <w:sz w:val="22"/>
+          <w:szCs w:val="22"/>
+        </w:rPr>
+        <w:t xml:space="preserve">Receiving a delivery (when the tanker arrives):</w:t>
+      </w:r>
+    </w:p>
+    <w:p>
+      <w:pPr>
+        <w:pStyle w:val="ListParagraph"/>
+        <w:numPr>
+          <w:ilvl w:val="0"/>
+          <w:numId w:val="2"/>
+        </w:numPr>
+        <w:spacing w:after="60" w:before="0" w:line="276"/>
+      </w:pPr>
+      <w:r>
+        <w:rPr>
+          <w:rFonts w:ascii="Calibri" w:cs="Calibri" w:eastAsia="Calibri" w:hAnsi="Calibri"/>
+          <w:sz w:val="22"/>
+          <w:szCs w:val="22"/>
+        </w:rPr>
+        <w:t xml:space="preserve">Find the delivery in the list and click </w:t>
+      </w:r>
+      <w:r>
+        <w:rPr>
+          <w:rFonts w:ascii="Calibri" w:cs="Calibri" w:eastAsia="Calibri" w:hAnsi="Calibri"/>
+          <w:b/>
+          <w:bCs/>
+          <w:sz w:val="22"/>
+          <w:szCs w:val="22"/>
+        </w:rPr>
+        <w:t xml:space="preserve">Mark as Completed</w:t>
+      </w:r>
+    </w:p>
+    <w:p>
+      <w:pPr>
+        <w:pStyle w:val="ListParagraph"/>
+        <w:numPr>
+          <w:ilvl w:val="0"/>
+          <w:numId w:val="2"/>
+        </w:numPr>
+        <w:spacing w:after="60" w:before="0" w:line="276"/>
+      </w:pPr>
+      <w:r>
+        <w:rPr>
+          <w:rFonts w:ascii="Calibri" w:cs="Calibri" w:eastAsia="Calibri" w:hAnsi="Calibri"/>
+          <w:sz w:val="22"/>
+          <w:szCs w:val="22"/>
+        </w:rPr>
+        <w:t xml:space="preserve">A </w:t>
+      </w:r>
+      <w:r>
+        <w:rPr>
+          <w:rFonts w:ascii="Calibri" w:cs="Calibri" w:eastAsia="Calibri" w:hAnsi="Calibri"/>
+          <w:b/>
+          <w:bCs/>
+          <w:sz w:val="22"/>
+          <w:szCs w:val="22"/>
+        </w:rPr>
+        <w:t xml:space="preserve">Receive Delivery</w:t>
+      </w:r>
+      <w:r>
+        <w:rPr>
+          <w:rFonts w:ascii="Calibri" w:cs="Calibri" w:eastAsia="Calibri" w:hAnsi="Calibri"/>
+          <w:sz w:val="22"/>
+          <w:szCs w:val="22"/>
+        </w:rPr>
+        <w:t xml:space="preserve"> dialog opens showing what was ordered — enter the </w:t>
+      </w:r>
+      <w:r>
+        <w:rPr>
+          <w:rFonts w:ascii="Calibri" w:cs="Calibri" w:eastAsia="Calibri" w:hAnsi="Calibri"/>
+          <w:b/>
+          <w:bCs/>
+          <w:sz w:val="22"/>
+          <w:szCs w:val="22"/>
+        </w:rPr>
+        <w:t xml:space="preserve">actual litres the tanker discharged</w:t>
+      </w:r>
+      <w:r>
+        <w:rPr>
+          <w:rFonts w:ascii="Calibri" w:cs="Calibri" w:eastAsia="Calibri" w:hAnsi="Calibri"/>
+          <w:sz w:val="22"/>
+          <w:szCs w:val="22"/>
+        </w:rPr>
+        <w:t xml:space="preserve"> (pre-filled with the ordered amount)</w:t>
+      </w:r>
+    </w:p>
+    <w:p>
+      <w:pPr>
+        <w:pStyle w:val="ListParagraph"/>
+        <w:numPr>
+          <w:ilvl w:val="0"/>
+          <w:numId w:val="2"/>
+        </w:numPr>
+        <w:spacing w:after="60" w:before="0" w:line="276"/>
+      </w:pPr>
+      <w:r>
+        <w:rPr>
+          <w:rFonts w:ascii="Calibri" w:cs="Calibri" w:eastAsia="Calibri" w:hAnsi="Calibri"/>
+          <w:sz w:val="22"/>
+          <w:szCs w:val="22"/>
+        </w:rPr>
+        <w:t xml:space="preserve">If the figure differs from the order, the dialog immediately shows a </w:t>
+      </w:r>
+      <w:r>
+        <w:rPr>
+          <w:rFonts w:ascii="Calibri" w:cs="Calibri" w:eastAsia="Calibri" w:hAnsi="Calibri"/>
+          <w:b/>
+          <w:bCs/>
+          <w:sz w:val="22"/>
+          <w:szCs w:val="22"/>
+        </w:rPr>
+        <w:t xml:space="preserve">short delivery</w:t>
+      </w:r>
+      <w:r>
+        <w:rPr>
+          <w:rFonts w:ascii="Calibri" w:cs="Calibri" w:eastAsia="Calibri" w:hAnsi="Calibri"/>
+          <w:sz w:val="22"/>
+          <w:szCs w:val="22"/>
+        </w:rPr>
+        <w:t xml:space="preserve"> or </w:t>
+      </w:r>
+      <w:r>
+        <w:rPr>
+          <w:rFonts w:ascii="Calibri" w:cs="Calibri" w:eastAsia="Calibri" w:hAnsi="Calibri"/>
+          <w:b/>
+          <w:bCs/>
+          <w:sz w:val="22"/>
+          <w:szCs w:val="22"/>
+        </w:rPr>
+        <w:t xml:space="preserve">over delivery</w:t>
+      </w:r>
+      <w:r>
+        <w:rPr>
+          <w:rFonts w:ascii="Calibri" w:cs="Calibri" w:eastAsia="Calibri" w:hAnsi="Calibri"/>
+          <w:sz w:val="22"/>
+          <w:szCs w:val="22"/>
+        </w:rPr>
+        <w:t xml:space="preserve"> warning so you can see the gap before confirming</w:t>
+      </w:r>
+    </w:p>
+    <w:p>
+      <w:pPr>
+        <w:pStyle w:val="ListParagraph"/>
+        <w:numPr>
+          <w:ilvl w:val="0"/>
+          <w:numId w:val="2"/>
+        </w:numPr>
+        <w:spacing w:after="60" w:before="0" w:line="276"/>
+      </w:pPr>
+      <w:r>
+        <w:rPr>
+          <w:rFonts w:ascii="Calibri" w:cs="Calibri" w:eastAsia="Calibri" w:hAnsi="Calibri"/>
+          <w:sz w:val="22"/>
+          <w:szCs w:val="22"/>
+        </w:rPr>
+        <w:t xml:space="preserve">Click </w:t>
+      </w:r>
+      <w:r>
+        <w:rPr>
+          <w:rFonts w:ascii="Calibri" w:cs="Calibri" w:eastAsia="Calibri" w:hAnsi="Calibri"/>
+          <w:b/>
+          <w:bCs/>
+          <w:sz w:val="22"/>
+          <w:szCs w:val="22"/>
+        </w:rPr>
+        <w:t xml:space="preserve">Confirm &amp; Fill Tank</w:t>
+      </w:r>
+      <w:r>
+        <w:rPr>
+          <w:rFonts w:ascii="Calibri" w:cs="Calibri" w:eastAsia="Calibri" w:hAnsi="Calibri"/>
+          <w:sz w:val="22"/>
+          <w:szCs w:val="22"/>
+        </w:rPr>
+        <w:t xml:space="preserve"> — the tank is filled with the *actual* litres received</w:t>
+      </w:r>
+    </w:p>
+    <w:p>
+      <w:pPr>
+        <w:pBdr>
+          <w:left w:val="thick" w:color="FFC107" w:sz="12"/>
+        </w:pBdr>
+        <w:shd w:fill="FFF8E1" w:val="clear"/>
+        <w:spacing w:after="80" w:before="80" w:line="276"/>
+        <w:ind w:left="431" w:right="431"/>
+      </w:pPr>
+      <w:r>
+        <w:rPr>
+          <w:rFonts w:ascii="Calibri" w:cs="Calibri" w:eastAsia="Calibri" w:hAnsi="Calibri"/>
+          <w:i/>
+          <w:iCs/>
+          <w:color w:val="5D4037"/>
+          <w:sz w:val="22"/>
+          <w:szCs w:val="22"/>
+        </w:rPr>
+        <w:t xml:space="preserve">The ordered quantity stays frozen on the record, so any shortfall automatically surfaces when your accountant matches the supplier's invoice (see Section 12). The accountant is also notified the moment a delivery is completed. For a split purchase, the invoice in Payables covers the whole `FDL-…` group — the goods receipt is treated as complete only once **every** tank in the purchase has been received.</w:t>
       </w:r>
     </w:p>
     <w:p>
@@ -25676,7 +25900,7 @@
           <w:sz w:val="22"/>
           <w:szCs w:val="22"/>
         </w:rPr>
-        <w:t xml:space="preserve">Fuel Management</w:t>
+        <w:t xml:space="preserve">Product Management</w:t>
       </w:r>
       <w:r>
         <w:rPr>

</xml_diff>

<commit_message>
user manual added to admin
</commit_message>
<xml_diff>
--- a/docs/user-guide.docx
+++ b/docs/user-guide.docx
@@ -83,7 +83,7 @@
           <w:sz w:val="20"/>
           <w:szCs w:val="20"/>
         </w:rPr>
-        <w:t xml:space="preserve">Version 1.0  ·  6 September 2026</w:t>
+        <w:t xml:space="preserve">Version 1.0  ·  7 September 2026</w:t>
       </w:r>
     </w:p>
     <w:p>
@@ -402,7 +402,7 @@
           <w:sz w:val="22"/>
           <w:szCs w:val="22"/>
         </w:rPr>
-        <w:t xml:space="preserve">[Payroll &amp; Commissions](#14-payroll--commissions)</w:t>
+        <w:t xml:space="preserve">[Payroll &amp; Commissions](#14-payroll--commissions) — salaries, allowances &amp; the pension base</w:t>
       </w:r>
     </w:p>
     <w:p>
@@ -20826,35 +20826,7 @@
           <w:sz w:val="26"/>
           <w:szCs w:val="26"/>
         </w:rPr>
-        <w:t xml:space="preserve">14.2 Commission Structures</w:t>
-      </w:r>
-    </w:p>
-    <w:p>
-      <w:pPr>
-        <w:spacing w:after="100" w:before="0" w:line="276"/>
-      </w:pPr>
-      <w:r>
-        <w:rPr>
-          <w:rFonts w:ascii="Calibri" w:cs="Calibri" w:eastAsia="Calibri" w:hAnsi="Calibri"/>
-          <w:sz w:val="22"/>
-          <w:szCs w:val="22"/>
-        </w:rPr>
-        <w:t xml:space="preserve">Commissions reward staff for sales performance.</w:t>
-      </w:r>
-    </w:p>
-    <w:p>
-      <w:pPr>
-        <w:spacing w:after="100" w:before="0" w:line="276"/>
-      </w:pPr>
-      <w:r>
-        <w:rPr>
-          <w:rFonts w:ascii="Calibri" w:cs="Calibri" w:eastAsia="Calibri" w:hAnsi="Calibri"/>
-          <w:b/>
-          <w:bCs/>
-          <w:sz w:val="22"/>
-          <w:szCs w:val="22"/>
-        </w:rPr>
-        <w:t xml:space="preserve">Setting Up a Commission Structure:</w:t>
+        <w:t xml:space="preserve">14.2 Allowances &amp; the Pension Base (PenCom)</w:t>
       </w:r>
     </w:p>
     <w:p>
@@ -20875,7 +20847,134 @@
           <w:sz w:val="22"/>
           <w:szCs w:val="22"/>
         </w:rPr>
-        <w:t xml:space="preserve">Done by the Manager</w:t>
+        <w:t xml:space="preserve">Accountant and Owner</w:t>
+      </w:r>
+    </w:p>
+    <w:p>
+      <w:pPr>
+        <w:spacing w:after="100" w:before="0" w:line="276"/>
+      </w:pPr>
+      <w:r>
+        <w:rPr>
+          <w:rFonts w:ascii="Calibri" w:cs="Calibri" w:eastAsia="Calibri" w:hAnsi="Calibri"/>
+          <w:b/>
+          <w:bCs/>
+          <w:sz w:val="22"/>
+          <w:szCs w:val="22"/>
+        </w:rPr>
+        <w:t xml:space="preserve">Why this matters.</w:t>
+      </w:r>
+      <w:r>
+        <w:rPr>
+          <w:rFonts w:ascii="Calibri" w:cs="Calibri" w:eastAsia="Calibri" w:hAnsi="Calibri"/>
+          <w:sz w:val="22"/>
+          <w:szCs w:val="22"/>
+        </w:rPr>
+        <w:t xml:space="preserve"> The Pension Reform Act 2014 sets pension at </w:t>
+      </w:r>
+      <w:r>
+        <w:rPr>
+          <w:rFonts w:ascii="Calibri" w:cs="Calibri" w:eastAsia="Calibri" w:hAnsi="Calibri"/>
+          <w:b/>
+          <w:bCs/>
+          <w:sz w:val="22"/>
+          <w:szCs w:val="22"/>
+        </w:rPr>
+        <w:t xml:space="preserve">18% of monthly emolument</w:t>
+      </w:r>
+      <w:r>
+        <w:rPr>
+          <w:rFonts w:ascii="Calibri" w:cs="Calibri" w:eastAsia="Calibri" w:hAnsi="Calibri"/>
+          <w:sz w:val="22"/>
+          <w:szCs w:val="22"/>
+        </w:rPr>
+        <w:t xml:space="preserve"> — 8% deducted from the employee and 10% paid by the employer. The Act defines monthly emolument as whatever the employment contract says, </w:t>
+      </w:r>
+      <w:r>
+        <w:rPr>
+          <w:rFonts w:ascii="Calibri" w:cs="Calibri" w:eastAsia="Calibri" w:hAnsi="Calibri"/>
+          <w:b/>
+          <w:bCs/>
+          <w:sz w:val="22"/>
+          <w:szCs w:val="22"/>
+        </w:rPr>
+        <w:t xml:space="preserve">but never less than basic salary + housing allowance + transport allowance</w:t>
+      </w:r>
+      <w:r>
+        <w:rPr>
+          <w:rFonts w:ascii="Calibri" w:cs="Calibri" w:eastAsia="Calibri" w:hAnsi="Calibri"/>
+          <w:sz w:val="22"/>
+          <w:szCs w:val="22"/>
+        </w:rPr>
+        <w:t xml:space="preserve">. A station that pays housing or transport allowances and computes pension on basic alone is </w:t>
+      </w:r>
+      <w:r>
+        <w:rPr>
+          <w:rFonts w:ascii="Calibri" w:cs="Calibri" w:eastAsia="Calibri" w:hAnsi="Calibri"/>
+          <w:b/>
+          <w:bCs/>
+          <w:sz w:val="22"/>
+          <w:szCs w:val="22"/>
+        </w:rPr>
+        <w:t xml:space="preserve">under-remitting</w:t>
+      </w:r>
+      <w:r>
+        <w:rPr>
+          <w:rFonts w:ascii="Calibri" w:cs="Calibri" w:eastAsia="Calibri" w:hAnsi="Calibri"/>
+          <w:sz w:val="22"/>
+          <w:szCs w:val="22"/>
+        </w:rPr>
+        <w:t xml:space="preserve">, and the shortfall accrues quietly, month after month.</w:t>
+      </w:r>
+    </w:p>
+    <w:p>
+      <w:pPr>
+        <w:pStyle w:val="Heading4"/>
+        <w:spacing w:after="40" w:before="120" w:line="276"/>
+      </w:pPr>
+      <w:r>
+        <w:rPr>
+          <w:rFonts w:ascii="Calibri" w:cs="Calibri" w:eastAsia="Calibri" w:hAnsi="Calibri"/>
+          <w:b/>
+          <w:bCs/>
+          <w:i/>
+          <w:iCs/>
+          <w:color w:val="2d5a8e"/>
+          <w:sz w:val="24"/>
+          <w:szCs w:val="24"/>
+        </w:rPr>
+        <w:t xml:space="preserve">Turning allowances on</w:t>
+      </w:r>
+    </w:p>
+    <w:p>
+      <w:pPr>
+        <w:spacing w:after="100" w:before="0" w:line="276"/>
+      </w:pPr>
+      <w:r>
+        <w:rPr>
+          <w:rFonts w:ascii="Calibri" w:cs="Calibri" w:eastAsia="Calibri" w:hAnsi="Calibri"/>
+          <w:sz w:val="22"/>
+          <w:szCs w:val="22"/>
+        </w:rPr>
+        <w:t xml:space="preserve">Allowances are </w:t>
+      </w:r>
+      <w:r>
+        <w:rPr>
+          <w:rFonts w:ascii="Calibri" w:cs="Calibri" w:eastAsia="Calibri" w:hAnsi="Calibri"/>
+          <w:b/>
+          <w:bCs/>
+          <w:sz w:val="22"/>
+          <w:szCs w:val="22"/>
+        </w:rPr>
+        <w:t xml:space="preserve">off by default</w:t>
+      </w:r>
+      <w:r>
+        <w:rPr>
+          <w:rFonts w:ascii="Calibri" w:cs="Calibri" w:eastAsia="Calibri" w:hAnsi="Calibri"/>
+          <w:sz w:val="22"/>
+          <w:szCs w:val="22"/>
+        </w:rPr>
+        <w:t xml:space="preserve">, and a station that pays a single flat wage can leave them off — payroll behaves exactly as it always has, with pension charged on basic salary.</w:t>
       </w:r>
     </w:p>
     <w:p>
@@ -20903,7 +21002,7 @@
           <w:sz w:val="22"/>
           <w:szCs w:val="22"/>
         </w:rPr>
-        <w:t xml:space="preserve">Commissions</w:t>
+        <w:t xml:space="preserve">Payroll</w:t>
       </w:r>
       <w:r>
         <w:rPr>
@@ -20921,7 +21020,7 @@
           <w:sz w:val="22"/>
           <w:szCs w:val="22"/>
         </w:rPr>
-        <w:t xml:space="preserve">Structure</w:t>
+        <w:t xml:space="preserve">Salary Structure</w:t>
       </w:r>
     </w:p>
     <w:p>
@@ -20949,71 +21048,99 @@
           <w:sz w:val="22"/>
           <w:szCs w:val="22"/>
         </w:rPr>
-        <w:t xml:space="preserve">Add Commission Rule</w:t>
-      </w:r>
-    </w:p>
-    <w:p>
-      <w:pPr>
-        <w:pStyle w:val="ListParagraph"/>
-        <w:numPr>
-          <w:ilvl w:val="0"/>
-          <w:numId w:val="2"/>
-        </w:numPr>
-        <w:spacing w:after="60" w:before="0" w:line="276"/>
-      </w:pPr>
-      <w:r>
-        <w:rPr>
-          <w:rFonts w:ascii="Calibri" w:cs="Calibri" w:eastAsia="Calibri" w:hAnsi="Calibri"/>
-          <w:sz w:val="22"/>
-          <w:szCs w:val="22"/>
-        </w:rPr>
-        <w:t xml:space="preserve">Choose the product type and the commission rate (percentage or fixed amount per litre/unit)</w:t>
-      </w:r>
-    </w:p>
-    <w:p>
-      <w:pPr>
-        <w:pStyle w:val="ListParagraph"/>
-        <w:numPr>
-          <w:ilvl w:val="0"/>
-          <w:numId w:val="2"/>
-        </w:numPr>
-        <w:spacing w:after="60" w:before="0" w:line="276"/>
-      </w:pPr>
-      <w:r>
-        <w:rPr>
-          <w:rFonts w:ascii="Calibri" w:cs="Calibri" w:eastAsia="Calibri" w:hAnsi="Calibri"/>
-          <w:sz w:val="22"/>
-          <w:szCs w:val="22"/>
-        </w:rPr>
-        <w:t xml:space="preserve">Set eligibility (which roles qualify)</w:t>
-      </w:r>
-    </w:p>
-    <w:p>
-      <w:pPr>
-        <w:pStyle w:val="ListParagraph"/>
-        <w:numPr>
-          <w:ilvl w:val="0"/>
-          <w:numId w:val="2"/>
-        </w:numPr>
-        <w:spacing w:after="60" w:before="0" w:line="276"/>
-      </w:pPr>
-      <w:r>
-        <w:rPr>
-          <w:rFonts w:ascii="Calibri" w:cs="Calibri" w:eastAsia="Calibri" w:hAnsi="Calibri"/>
-          <w:sz w:val="22"/>
-          <w:szCs w:val="22"/>
-        </w:rPr>
-        <w:t xml:space="preserve">Click </w:t>
-      </w:r>
-      <w:r>
-        <w:rPr>
-          <w:rFonts w:ascii="Calibri" w:cs="Calibri" w:eastAsia="Calibri" w:hAnsi="Calibri"/>
-          <w:b/>
-          <w:bCs/>
-          <w:sz w:val="22"/>
-          <w:szCs w:val="22"/>
-        </w:rPr>
-        <w:t xml:space="preserve">Save</w:t>
+        <w:t xml:space="preserve">Set up allowances</w:t>
+      </w:r>
+      <w:r>
+        <w:rPr>
+          <w:rFonts w:ascii="Calibri" w:cs="Calibri" w:eastAsia="Calibri" w:hAnsi="Calibri"/>
+          <w:sz w:val="22"/>
+          <w:szCs w:val="22"/>
+        </w:rPr>
+        <w:t xml:space="preserve"> (beside the pension toggle)</w:t>
+      </w:r>
+    </w:p>
+    <w:p>
+      <w:pPr>
+        <w:pStyle w:val="ListParagraph"/>
+        <w:numPr>
+          <w:ilvl w:val="0"/>
+          <w:numId w:val="2"/>
+        </w:numPr>
+        <w:spacing w:after="60" w:before="0" w:line="276"/>
+      </w:pPr>
+      <w:r>
+        <w:rPr>
+          <w:rFonts w:ascii="Calibri" w:cs="Calibri" w:eastAsia="Calibri" w:hAnsi="Calibri"/>
+          <w:sz w:val="22"/>
+          <w:szCs w:val="22"/>
+        </w:rPr>
+        <w:t xml:space="preserve">Tick </w:t>
+      </w:r>
+      <w:r>
+        <w:rPr>
+          <w:rFonts w:ascii="Calibri" w:cs="Calibri" w:eastAsia="Calibri" w:hAnsi="Calibri"/>
+          <w:b/>
+          <w:bCs/>
+          <w:sz w:val="22"/>
+          <w:szCs w:val="22"/>
+        </w:rPr>
+        <w:t xml:space="preserve">Use allowances in payroll</w:t>
+      </w:r>
+    </w:p>
+    <w:p>
+      <w:pPr>
+        <w:pStyle w:val="ListParagraph"/>
+        <w:numPr>
+          <w:ilvl w:val="0"/>
+          <w:numId w:val="2"/>
+        </w:numPr>
+        <w:spacing w:after="60" w:before="0" w:line="276"/>
+      </w:pPr>
+      <w:r>
+        <w:rPr>
+          <w:rFonts w:ascii="Calibri" w:cs="Calibri" w:eastAsia="Calibri" w:hAnsi="Calibri"/>
+          <w:sz w:val="22"/>
+          <w:szCs w:val="22"/>
+        </w:rPr>
+        <w:t xml:space="preserve">Tick the allowances this station actually pays, and tick </w:t>
+      </w:r>
+      <w:r>
+        <w:rPr>
+          <w:rFonts w:ascii="Calibri" w:cs="Calibri" w:eastAsia="Calibri" w:hAnsi="Calibri"/>
+          <w:b/>
+          <w:bCs/>
+          <w:sz w:val="22"/>
+          <w:szCs w:val="22"/>
+        </w:rPr>
+        <w:t xml:space="preserve">Pensionable</w:t>
+      </w:r>
+      <w:r>
+        <w:rPr>
+          <w:rFonts w:ascii="Calibri" w:cs="Calibri" w:eastAsia="Calibri" w:hAnsi="Calibri"/>
+          <w:sz w:val="22"/>
+          <w:szCs w:val="22"/>
+        </w:rPr>
+        <w:t xml:space="preserve"> for any your employment contracts treat as part of monthly emolument</w:t>
+      </w:r>
+    </w:p>
+    <w:p>
+      <w:pPr>
+        <w:pStyle w:val="ListParagraph"/>
+        <w:numPr>
+          <w:ilvl w:val="0"/>
+          <w:numId w:val="2"/>
+        </w:numPr>
+        <w:spacing w:after="60" w:before="0" w:line="276"/>
+      </w:pPr>
+      <w:r>
+        <w:rPr>
+          <w:rFonts w:ascii="Calibri" w:cs="Calibri" w:eastAsia="Calibri" w:hAnsi="Calibri"/>
+          <w:b/>
+          <w:bCs/>
+          <w:sz w:val="22"/>
+          <w:szCs w:val="22"/>
+        </w:rPr>
+        <w:t xml:space="preserve">Save settings</w:t>
       </w:r>
     </w:p>
     <w:p>
@@ -21023,76 +21150,1248 @@
       <w:r>
         <w:rPr>
           <w:rFonts w:ascii="Calibri" w:cs="Calibri" w:eastAsia="Calibri" w:hAnsi="Calibri"/>
-          <w:b/>
-          <w:bCs/>
-          <w:sz w:val="22"/>
-          <w:szCs w:val="22"/>
-        </w:rPr>
-        <w:t xml:space="preserve">Viewing Commission Payments:</w:t>
-      </w:r>
-    </w:p>
-    <w:p>
-      <w:pPr>
-        <w:pStyle w:val="ListParagraph"/>
-        <w:numPr>
-          <w:ilvl w:val="0"/>
-          <w:numId w:val="2"/>
-        </w:numPr>
-        <w:spacing w:after="60" w:before="0" w:line="276"/>
-      </w:pPr>
-      <w:r>
-        <w:rPr>
-          <w:rFonts w:ascii="Calibri" w:cs="Calibri" w:eastAsia="Calibri" w:hAnsi="Calibri"/>
-          <w:sz w:val="22"/>
-          <w:szCs w:val="22"/>
-        </w:rPr>
-        <w:t xml:space="preserve">Go to </w:t>
-      </w:r>
-      <w:r>
-        <w:rPr>
-          <w:rFonts w:ascii="Calibri" w:cs="Calibri" w:eastAsia="Calibri" w:hAnsi="Calibri"/>
-          <w:b/>
-          <w:bCs/>
-          <w:sz w:val="22"/>
-          <w:szCs w:val="22"/>
-        </w:rPr>
-        <w:t xml:space="preserve">Commissions</w:t>
-      </w:r>
-      <w:r>
-        <w:rPr>
-          <w:rFonts w:ascii="Calibri" w:cs="Calibri" w:eastAsia="Calibri" w:hAnsi="Calibri"/>
-          <w:sz w:val="22"/>
-          <w:szCs w:val="22"/>
-        </w:rPr>
-        <w:t xml:space="preserve"> &gt; </w:t>
-      </w:r>
-      <w:r>
-        <w:rPr>
-          <w:rFonts w:ascii="Calibri" w:cs="Calibri" w:eastAsia="Calibri" w:hAnsi="Calibri"/>
-          <w:b/>
-          <w:bCs/>
-          <w:sz w:val="22"/>
-          <w:szCs w:val="22"/>
-        </w:rPr>
-        <w:t xml:space="preserve">Payment History</w:t>
-      </w:r>
-    </w:p>
-    <w:p>
-      <w:pPr>
-        <w:pStyle w:val="ListParagraph"/>
-        <w:numPr>
-          <w:ilvl w:val="0"/>
-          <w:numId w:val="2"/>
-        </w:numPr>
-        <w:spacing w:after="60" w:before="0" w:line="276"/>
-      </w:pPr>
-      <w:r>
-        <w:rPr>
-          <w:rFonts w:ascii="Calibri" w:cs="Calibri" w:eastAsia="Calibri" w:hAnsi="Calibri"/>
-          <w:sz w:val="22"/>
-          <w:szCs w:val="22"/>
-        </w:rPr>
-        <w:t xml:space="preserve">See earned commissions by staff member and period</w:t>
+          <w:sz w:val="22"/>
+          <w:szCs w:val="22"/>
+        </w:rPr>
+        <w:t xml:space="preserve">The catalogue ships with the allowances a Nigerian station commonly pays — housing, transport, meal, utility, entertainment, medical, leave, wardrobe, furniture, responsibility, hazard and shift. If you pay something not listed, type its name in the box at the bottom and click </w:t>
+      </w:r>
+      <w:r>
+        <w:rPr>
+          <w:rFonts w:ascii="Calibri" w:cs="Calibri" w:eastAsia="Calibri" w:hAnsi="Calibri"/>
+          <w:b/>
+          <w:bCs/>
+          <w:sz w:val="22"/>
+          <w:szCs w:val="22"/>
+        </w:rPr>
+        <w:t xml:space="preserve">Add</w:t>
+      </w:r>
+      <w:r>
+        <w:rPr>
+          <w:rFonts w:ascii="Calibri" w:cs="Calibri" w:eastAsia="Calibri" w:hAnsi="Calibri"/>
+          <w:sz w:val="22"/>
+          <w:szCs w:val="22"/>
+        </w:rPr>
+        <w:t xml:space="preserve">.</w:t>
+      </w:r>
+    </w:p>
+    <w:p>
+      <w:pPr>
+        <w:pBdr>
+          <w:left w:val="thick" w:color="FFC107" w:sz="12"/>
+        </w:pBdr>
+        <w:shd w:fill="FFF8E1" w:val="clear"/>
+        <w:spacing w:after="80" w:before="80" w:line="276"/>
+        <w:ind w:left="431" w:right="431"/>
+      </w:pPr>
+      <w:r>
+        <w:rPr>
+          <w:rFonts w:ascii="Calibri" w:cs="Calibri" w:eastAsia="Calibri" w:hAnsi="Calibri"/>
+          <w:i/>
+          <w:iCs/>
+          <w:color w:val="5D4037"/>
+          <w:sz w:val="22"/>
+          <w:szCs w:val="22"/>
+        </w:rPr>
+        <w:t xml:space="preserve">**Housing and transport cannot be switched off or excluded from pension.** They are the Act's minimum, so the system locks them on. Everything else is your choice, because the Act defers to your contracts for anything above that floor.</w:t>
+      </w:r>
+    </w:p>
+    <w:p>
+      <w:pPr>
+        <w:pStyle w:val="Heading4"/>
+        <w:spacing w:after="40" w:before="120" w:line="276"/>
+      </w:pPr>
+      <w:r>
+        <w:rPr>
+          <w:rFonts w:ascii="Calibri" w:cs="Calibri" w:eastAsia="Calibri" w:hAnsi="Calibri"/>
+          <w:b/>
+          <w:bCs/>
+          <w:i/>
+          <w:iCs/>
+          <w:color w:val="2d5a8e"/>
+          <w:sz w:val="24"/>
+          <w:szCs w:val="24"/>
+        </w:rPr>
+        <w:t xml:space="preserve">Entering each staff member's figures</w:t>
+      </w:r>
+    </w:p>
+    <w:p>
+      <w:pPr>
+        <w:pStyle w:val="ListParagraph"/>
+        <w:numPr>
+          <w:ilvl w:val="0"/>
+          <w:numId w:val="2"/>
+        </w:numPr>
+        <w:spacing w:after="60" w:before="0" w:line="276"/>
+      </w:pPr>
+      <w:r>
+        <w:rPr>
+          <w:rFonts w:ascii="Calibri" w:cs="Calibri" w:eastAsia="Calibri" w:hAnsi="Calibri"/>
+          <w:sz w:val="22"/>
+          <w:szCs w:val="22"/>
+        </w:rPr>
+        <w:t xml:space="preserve">In the salary structure table, click the </w:t>
+      </w:r>
+      <w:r>
+        <w:rPr>
+          <w:rFonts w:ascii="Calibri" w:cs="Calibri" w:eastAsia="Calibri" w:hAnsi="Calibri"/>
+          <w:b/>
+          <w:bCs/>
+          <w:sz w:val="22"/>
+          <w:szCs w:val="22"/>
+        </w:rPr>
+        <w:t xml:space="preserve">Allowances</w:t>
+      </w:r>
+      <w:r>
+        <w:rPr>
+          <w:rFonts w:ascii="Calibri" w:cs="Calibri" w:eastAsia="Calibri" w:hAnsi="Calibri"/>
+          <w:sz w:val="22"/>
+          <w:szCs w:val="22"/>
+        </w:rPr>
+        <w:t xml:space="preserve"> figure on a staff member's row</w:t>
+      </w:r>
+    </w:p>
+    <w:p>
+      <w:pPr>
+        <w:pStyle w:val="ListParagraph"/>
+        <w:numPr>
+          <w:ilvl w:val="0"/>
+          <w:numId w:val="2"/>
+        </w:numPr>
+        <w:spacing w:after="60" w:before="0" w:line="276"/>
+      </w:pPr>
+      <w:r>
+        <w:rPr>
+          <w:rFonts w:ascii="Calibri" w:cs="Calibri" w:eastAsia="Calibri" w:hAnsi="Calibri"/>
+          <w:sz w:val="22"/>
+          <w:szCs w:val="22"/>
+        </w:rPr>
+        <w:t xml:space="preserve">Enter the monthly amount for each allowance</w:t>
+      </w:r>
+    </w:p>
+    <w:p>
+      <w:pPr>
+        <w:pStyle w:val="ListParagraph"/>
+        <w:numPr>
+          <w:ilvl w:val="0"/>
+          <w:numId w:val="2"/>
+        </w:numPr>
+        <w:spacing w:after="60" w:before="0" w:line="276"/>
+      </w:pPr>
+      <w:r>
+        <w:rPr>
+          <w:rFonts w:ascii="Calibri" w:cs="Calibri" w:eastAsia="Calibri" w:hAnsi="Calibri"/>
+          <w:sz w:val="22"/>
+          <w:szCs w:val="22"/>
+        </w:rPr>
+        <w:t xml:space="preserve">The panel shows the </w:t>
+      </w:r>
+      <w:r>
+        <w:rPr>
+          <w:rFonts w:ascii="Calibri" w:cs="Calibri" w:eastAsia="Calibri" w:hAnsi="Calibri"/>
+          <w:b/>
+          <w:bCs/>
+          <w:sz w:val="22"/>
+          <w:szCs w:val="22"/>
+        </w:rPr>
+        <w:t xml:space="preserve">pension base</w:t>
+      </w:r>
+      <w:r>
+        <w:rPr>
+          <w:rFonts w:ascii="Calibri" w:cs="Calibri" w:eastAsia="Calibri" w:hAnsi="Calibri"/>
+          <w:sz w:val="22"/>
+          <w:szCs w:val="22"/>
+        </w:rPr>
+        <w:t xml:space="preserve"> updating live — basic + pensionable allowances — with the 8% and 10% it produces</w:t>
+      </w:r>
+    </w:p>
+    <w:p>
+      <w:pPr>
+        <w:pStyle w:val="ListParagraph"/>
+        <w:numPr>
+          <w:ilvl w:val="0"/>
+          <w:numId w:val="2"/>
+        </w:numPr>
+        <w:spacing w:after="60" w:before="0" w:line="276"/>
+      </w:pPr>
+      <w:r>
+        <w:rPr>
+          <w:rFonts w:ascii="Calibri" w:cs="Calibri" w:eastAsia="Calibri" w:hAnsi="Calibri"/>
+          <w:b/>
+          <w:bCs/>
+          <w:sz w:val="22"/>
+          <w:szCs w:val="22"/>
+        </w:rPr>
+        <w:t xml:space="preserve">Save allowances</w:t>
+      </w:r>
+    </w:p>
+    <w:p>
+      <w:pPr>
+        <w:spacing w:after="100" w:before="0" w:line="276"/>
+      </w:pPr>
+      <w:r>
+        <w:rPr>
+          <w:rFonts w:ascii="Calibri" w:cs="Calibri" w:eastAsia="Calibri" w:hAnsi="Calibri"/>
+          <w:sz w:val="22"/>
+          <w:szCs w:val="22"/>
+        </w:rPr>
+        <w:t xml:space="preserve">The amounts are saved against the </w:t>
+      </w:r>
+      <w:r>
+        <w:rPr>
+          <w:rFonts w:ascii="Calibri" w:cs="Calibri" w:eastAsia="Calibri" w:hAnsi="Calibri"/>
+          <w:b/>
+          <w:bCs/>
+          <w:sz w:val="22"/>
+          <w:szCs w:val="22"/>
+        </w:rPr>
+        <w:t xml:space="preserve">staff member</w:t>
+      </w:r>
+      <w:r>
+        <w:rPr>
+          <w:rFonts w:ascii="Calibri" w:cs="Calibri" w:eastAsia="Calibri" w:hAnsi="Calibri"/>
+          <w:sz w:val="22"/>
+          <w:szCs w:val="22"/>
+        </w:rPr>
+        <w:t xml:space="preserve">, not the month, so they prefill every payroll from then on — the same way basic salary does. You only enter them once, and change them when the person's pay changes.</w:t>
+      </w:r>
+    </w:p>
+    <w:p>
+      <w:pPr>
+        <w:pStyle w:val="Heading4"/>
+        <w:spacing w:after="40" w:before="120" w:line="276"/>
+      </w:pPr>
+      <w:r>
+        <w:rPr>
+          <w:rFonts w:ascii="Calibri" w:cs="Calibri" w:eastAsia="Calibri" w:hAnsi="Calibri"/>
+          <w:b/>
+          <w:bCs/>
+          <w:i/>
+          <w:iCs/>
+          <w:color w:val="2d5a8e"/>
+          <w:sz w:val="24"/>
+          <w:szCs w:val="24"/>
+        </w:rPr>
+        <w:t xml:space="preserve">What changes on the payroll</w:t>
+      </w:r>
+    </w:p>
+    <w:p>
+      <w:pPr>
+        <w:spacing w:after="80" w:before="80" w:line="276"/>
+      </w:pPr>
+      <w:r>
+        <w:rPr>
+          <w:rFonts w:ascii="Calibri" w:cs="Calibri" w:eastAsia="Calibri" w:hAnsi="Calibri"/>
+          <w:sz w:val="22"/>
+          <w:szCs w:val="22"/>
+        </w:rPr>
+        <w:t xml:space="preserve"/>
+      </w:r>
+    </w:p>
+    <w:tbl>
+      <w:tblPr>
+        <w:tblW w:type="pct" w:w="100%"/>
+        <w:tblBorders>
+          <w:top w:val="single" w:color="auto" w:sz="4"/>
+          <w:left w:val="single" w:color="auto" w:sz="4"/>
+          <w:bottom w:val="single" w:color="auto" w:sz="4"/>
+          <w:right w:val="single" w:color="auto" w:sz="4"/>
+          <w:insideH w:val="single" w:color="auto" w:sz="4"/>
+          <w:insideV w:val="single" w:color="auto" w:sz="4"/>
+        </w:tblBorders>
+        <w:tblCellMar>
+          <w:top w:type="dxa" w:w="0"/>
+          <w:bottom w:type="dxa" w:w="0"/>
+        </w:tblCellMar>
+      </w:tblPr>
+      <w:tblGrid>
+        <w:gridCol w:w="100"/>
+        <w:gridCol w:w="100"/>
+        <w:gridCol w:w="100"/>
+      </w:tblGrid>
+      <w:tr>
+        <w:trPr>
+          <w:tblHeader/>
+        </w:trPr>
+        <w:tc>
+          <w:tcPr>
+            <w:tcBorders>
+              <w:top w:val="single" w:color="1a71f6" w:sz="4"/>
+              <w:left w:val="single" w:color="1a71f6" w:sz="4"/>
+              <w:bottom w:val="single" w:color="1a71f6" w:sz="4"/>
+              <w:right w:val="single" w:color="1a71f6" w:sz="4"/>
+            </w:tcBorders>
+            <w:shd w:fill="1a71f6" w:val="clear"/>
+            <w:tcMar>
+              <w:top w:type="dxa" w:w="80"/>
+              <w:left w:type="dxa" w:w="120"/>
+              <w:bottom w:type="dxa" w:w="80"/>
+              <w:right w:type="dxa" w:w="120"/>
+            </w:tcMar>
+          </w:tcPr>
+          <w:p>
+            <w:pPr>
+              <w:spacing w:after="0" w:before="0" w:line="276"/>
+            </w:pPr>
+            <w:r>
+              <w:rPr>
+                <w:rFonts w:ascii="Calibri" w:cs="Calibri" w:eastAsia="Calibri" w:hAnsi="Calibri"/>
+                <w:b/>
+                <w:bCs/>
+                <w:color w:val="FFFFFF"/>
+                <w:sz w:val="20"/>
+                <w:szCs w:val="20"/>
+              </w:rPr>
+              <w:t xml:space="preserve">Figure</w:t>
+            </w:r>
+          </w:p>
+        </w:tc>
+        <w:tc>
+          <w:tcPr>
+            <w:tcBorders>
+              <w:top w:val="single" w:color="1a71f6" w:sz="4"/>
+              <w:left w:val="single" w:color="1a71f6" w:sz="4"/>
+              <w:bottom w:val="single" w:color="1a71f6" w:sz="4"/>
+              <w:right w:val="single" w:color="1a71f6" w:sz="4"/>
+            </w:tcBorders>
+            <w:shd w:fill="1a71f6" w:val="clear"/>
+            <w:tcMar>
+              <w:top w:type="dxa" w:w="80"/>
+              <w:left w:type="dxa" w:w="120"/>
+              <w:bottom w:type="dxa" w:w="80"/>
+              <w:right w:type="dxa" w:w="120"/>
+            </w:tcMar>
+          </w:tcPr>
+          <w:p>
+            <w:pPr>
+              <w:spacing w:after="0" w:before="0" w:line="276"/>
+            </w:pPr>
+            <w:r>
+              <w:rPr>
+                <w:rFonts w:ascii="Calibri" w:cs="Calibri" w:eastAsia="Calibri" w:hAnsi="Calibri"/>
+                <w:b/>
+                <w:bCs/>
+                <w:color w:val="FFFFFF"/>
+                <w:sz w:val="20"/>
+                <w:szCs w:val="20"/>
+              </w:rPr>
+              <w:t xml:space="preserve">Without allowances</w:t>
+            </w:r>
+          </w:p>
+        </w:tc>
+        <w:tc>
+          <w:tcPr>
+            <w:tcBorders>
+              <w:top w:val="single" w:color="1a71f6" w:sz="4"/>
+              <w:left w:val="single" w:color="1a71f6" w:sz="4"/>
+              <w:bottom w:val="single" w:color="1a71f6" w:sz="4"/>
+              <w:right w:val="single" w:color="1a71f6" w:sz="4"/>
+            </w:tcBorders>
+            <w:shd w:fill="1a71f6" w:val="clear"/>
+            <w:tcMar>
+              <w:top w:type="dxa" w:w="80"/>
+              <w:left w:type="dxa" w:w="120"/>
+              <w:bottom w:type="dxa" w:w="80"/>
+              <w:right w:type="dxa" w:w="120"/>
+            </w:tcMar>
+          </w:tcPr>
+          <w:p>
+            <w:pPr>
+              <w:spacing w:after="0" w:before="0" w:line="276"/>
+            </w:pPr>
+            <w:r>
+              <w:rPr>
+                <w:rFonts w:ascii="Calibri" w:cs="Calibri" w:eastAsia="Calibri" w:hAnsi="Calibri"/>
+                <w:b/>
+                <w:bCs/>
+                <w:color w:val="FFFFFF"/>
+                <w:sz w:val="20"/>
+                <w:szCs w:val="20"/>
+              </w:rPr>
+              <w:t xml:space="preserve">With allowances</w:t>
+            </w:r>
+          </w:p>
+        </w:tc>
+      </w:tr>
+      <w:tr>
+        <w:tc>
+          <w:tcPr>
+            <w:tcBorders>
+              <w:top w:val="single" w:color="C5D5EA" w:sz="4"/>
+              <w:left w:val="single" w:color="C5D5EA" w:sz="4"/>
+              <w:bottom w:val="single" w:color="C5D5EA" w:sz="4"/>
+              <w:right w:val="single" w:color="C5D5EA" w:sz="4"/>
+            </w:tcBorders>
+            <w:shd w:fill="FFFFFF" w:val="clear"/>
+            <w:tcMar>
+              <w:top w:type="dxa" w:w="80"/>
+              <w:left w:type="dxa" w:w="120"/>
+              <w:bottom w:type="dxa" w:w="80"/>
+              <w:right w:type="dxa" w:w="120"/>
+            </w:tcMar>
+          </w:tcPr>
+          <w:p>
+            <w:pPr>
+              <w:spacing w:after="0" w:before="0" w:line="276"/>
+            </w:pPr>
+            <w:r>
+              <w:rPr>
+                <w:rFonts w:ascii="Calibri" w:cs="Calibri" w:eastAsia="Calibri" w:hAnsi="Calibri"/>
+                <w:b w:val="false"/>
+                <w:bCs w:val="false"/>
+                <w:color w:val="1A1A2E"/>
+                <w:sz w:val="20"/>
+                <w:szCs w:val="20"/>
+              </w:rPr>
+              <w:t xml:space="preserve">Pension base</w:t>
+            </w:r>
+          </w:p>
+        </w:tc>
+        <w:tc>
+          <w:tcPr>
+            <w:tcBorders>
+              <w:top w:val="single" w:color="C5D5EA" w:sz="4"/>
+              <w:left w:val="single" w:color="C5D5EA" w:sz="4"/>
+              <w:bottom w:val="single" w:color="C5D5EA" w:sz="4"/>
+              <w:right w:val="single" w:color="C5D5EA" w:sz="4"/>
+            </w:tcBorders>
+            <w:shd w:fill="FFFFFF" w:val="clear"/>
+            <w:tcMar>
+              <w:top w:type="dxa" w:w="80"/>
+              <w:left w:type="dxa" w:w="120"/>
+              <w:bottom w:type="dxa" w:w="80"/>
+              <w:right w:type="dxa" w:w="120"/>
+            </w:tcMar>
+          </w:tcPr>
+          <w:p>
+            <w:pPr>
+              <w:spacing w:after="0" w:before="0" w:line="276"/>
+            </w:pPr>
+            <w:r>
+              <w:rPr>
+                <w:rFonts w:ascii="Calibri" w:cs="Calibri" w:eastAsia="Calibri" w:hAnsi="Calibri"/>
+                <w:b w:val="false"/>
+                <w:bCs w:val="false"/>
+                <w:color w:val="1A1A2E"/>
+                <w:sz w:val="20"/>
+                <w:szCs w:val="20"/>
+              </w:rPr>
+              <w:t xml:space="preserve">Basic salary</w:t>
+            </w:r>
+          </w:p>
+        </w:tc>
+        <w:tc>
+          <w:tcPr>
+            <w:tcBorders>
+              <w:top w:val="single" w:color="C5D5EA" w:sz="4"/>
+              <w:left w:val="single" w:color="C5D5EA" w:sz="4"/>
+              <w:bottom w:val="single" w:color="C5D5EA" w:sz="4"/>
+              <w:right w:val="single" w:color="C5D5EA" w:sz="4"/>
+            </w:tcBorders>
+            <w:shd w:fill="FFFFFF" w:val="clear"/>
+            <w:tcMar>
+              <w:top w:type="dxa" w:w="80"/>
+              <w:left w:type="dxa" w:w="120"/>
+              <w:bottom w:type="dxa" w:w="80"/>
+              <w:right w:type="dxa" w:w="120"/>
+            </w:tcMar>
+          </w:tcPr>
+          <w:p>
+            <w:pPr>
+              <w:spacing w:after="0" w:before="0" w:line="276"/>
+            </w:pPr>
+            <w:r>
+              <w:rPr>
+                <w:rFonts w:ascii="Calibri" w:cs="Calibri" w:eastAsia="Calibri" w:hAnsi="Calibri"/>
+                <w:b w:val="false"/>
+                <w:bCs w:val="false"/>
+                <w:color w:val="1A1A2E"/>
+                <w:sz w:val="20"/>
+                <w:szCs w:val="20"/>
+              </w:rPr>
+              <w:t xml:space="preserve">Basic + pensionable allowances</w:t>
+            </w:r>
+          </w:p>
+        </w:tc>
+      </w:tr>
+      <w:tr>
+        <w:tc>
+          <w:tcPr>
+            <w:tcBorders>
+              <w:top w:val="single" w:color="C5D5EA" w:sz="4"/>
+              <w:left w:val="single" w:color="C5D5EA" w:sz="4"/>
+              <w:bottom w:val="single" w:color="C5D5EA" w:sz="4"/>
+              <w:right w:val="single" w:color="C5D5EA" w:sz="4"/>
+            </w:tcBorders>
+            <w:shd w:fill="EEF4FF" w:val="clear"/>
+            <w:tcMar>
+              <w:top w:type="dxa" w:w="80"/>
+              <w:left w:type="dxa" w:w="120"/>
+              <w:bottom w:type="dxa" w:w="80"/>
+              <w:right w:type="dxa" w:w="120"/>
+            </w:tcMar>
+          </w:tcPr>
+          <w:p>
+            <w:pPr>
+              <w:spacing w:after="0" w:before="0" w:line="276"/>
+            </w:pPr>
+            <w:r>
+              <w:rPr>
+                <w:rFonts w:ascii="Calibri" w:cs="Calibri" w:eastAsia="Calibri" w:hAnsi="Calibri"/>
+                <w:b w:val="false"/>
+                <w:bCs w:val="false"/>
+                <w:color w:val="1A1A2E"/>
+                <w:sz w:val="20"/>
+                <w:szCs w:val="20"/>
+              </w:rPr>
+              <w:t xml:space="preserve">PAYE base</w:t>
+            </w:r>
+          </w:p>
+        </w:tc>
+        <w:tc>
+          <w:tcPr>
+            <w:tcBorders>
+              <w:top w:val="single" w:color="C5D5EA" w:sz="4"/>
+              <w:left w:val="single" w:color="C5D5EA" w:sz="4"/>
+              <w:bottom w:val="single" w:color="C5D5EA" w:sz="4"/>
+              <w:right w:val="single" w:color="C5D5EA" w:sz="4"/>
+            </w:tcBorders>
+            <w:shd w:fill="EEF4FF" w:val="clear"/>
+            <w:tcMar>
+              <w:top w:type="dxa" w:w="80"/>
+              <w:left w:type="dxa" w:w="120"/>
+              <w:bottom w:type="dxa" w:w="80"/>
+              <w:right w:type="dxa" w:w="120"/>
+            </w:tcMar>
+          </w:tcPr>
+          <w:p>
+            <w:pPr>
+              <w:spacing w:after="0" w:before="0" w:line="276"/>
+            </w:pPr>
+            <w:r>
+              <w:rPr>
+                <w:rFonts w:ascii="Calibri" w:cs="Calibri" w:eastAsia="Calibri" w:hAnsi="Calibri"/>
+                <w:b w:val="false"/>
+                <w:bCs w:val="false"/>
+                <w:color w:val="1A1A2E"/>
+                <w:sz w:val="20"/>
+                <w:szCs w:val="20"/>
+              </w:rPr>
+              <w:t xml:space="preserve">Basic salary</w:t>
+            </w:r>
+          </w:p>
+        </w:tc>
+        <w:tc>
+          <w:tcPr>
+            <w:tcBorders>
+              <w:top w:val="single" w:color="C5D5EA" w:sz="4"/>
+              <w:left w:val="single" w:color="C5D5EA" w:sz="4"/>
+              <w:bottom w:val="single" w:color="C5D5EA" w:sz="4"/>
+              <w:right w:val="single" w:color="C5D5EA" w:sz="4"/>
+            </w:tcBorders>
+            <w:shd w:fill="EEF4FF" w:val="clear"/>
+            <w:tcMar>
+              <w:top w:type="dxa" w:w="80"/>
+              <w:left w:type="dxa" w:w="120"/>
+              <w:bottom w:type="dxa" w:w="80"/>
+              <w:right w:type="dxa" w:w="120"/>
+            </w:tcMar>
+          </w:tcPr>
+          <w:p>
+            <w:pPr>
+              <w:spacing w:after="0" w:before="0" w:line="276"/>
+            </w:pPr>
+            <w:r>
+              <w:rPr>
+                <w:rFonts w:ascii="Calibri" w:cs="Calibri" w:eastAsia="Calibri" w:hAnsi="Calibri"/>
+                <w:b w:val="false"/>
+                <w:bCs w:val="false"/>
+                <w:color w:val="1A1A2E"/>
+                <w:sz w:val="20"/>
+                <w:szCs w:val="20"/>
+              </w:rPr>
+              <w:t xml:space="preserve">Basic + all allowances</w:t>
+            </w:r>
+          </w:p>
+        </w:tc>
+      </w:tr>
+      <w:tr>
+        <w:tc>
+          <w:tcPr>
+            <w:tcBorders>
+              <w:top w:val="single" w:color="C5D5EA" w:sz="4"/>
+              <w:left w:val="single" w:color="C5D5EA" w:sz="4"/>
+              <w:bottom w:val="single" w:color="C5D5EA" w:sz="4"/>
+              <w:right w:val="single" w:color="C5D5EA" w:sz="4"/>
+            </w:tcBorders>
+            <w:shd w:fill="FFFFFF" w:val="clear"/>
+            <w:tcMar>
+              <w:top w:type="dxa" w:w="80"/>
+              <w:left w:type="dxa" w:w="120"/>
+              <w:bottom w:type="dxa" w:w="80"/>
+              <w:right w:type="dxa" w:w="120"/>
+            </w:tcMar>
+          </w:tcPr>
+          <w:p>
+            <w:pPr>
+              <w:spacing w:after="0" w:before="0" w:line="276"/>
+            </w:pPr>
+            <w:r>
+              <w:rPr>
+                <w:rFonts w:ascii="Calibri" w:cs="Calibri" w:eastAsia="Calibri" w:hAnsi="Calibri"/>
+                <w:b w:val="false"/>
+                <w:bCs w:val="false"/>
+                <w:color w:val="1A1A2E"/>
+                <w:sz w:val="20"/>
+                <w:szCs w:val="20"/>
+              </w:rPr>
+              <w:t xml:space="preserve">Salary to pay</w:t>
+            </w:r>
+          </w:p>
+        </w:tc>
+        <w:tc>
+          <w:tcPr>
+            <w:tcBorders>
+              <w:top w:val="single" w:color="C5D5EA" w:sz="4"/>
+              <w:left w:val="single" w:color="C5D5EA" w:sz="4"/>
+              <w:bottom w:val="single" w:color="C5D5EA" w:sz="4"/>
+              <w:right w:val="single" w:color="C5D5EA" w:sz="4"/>
+            </w:tcBorders>
+            <w:shd w:fill="FFFFFF" w:val="clear"/>
+            <w:tcMar>
+              <w:top w:type="dxa" w:w="80"/>
+              <w:left w:type="dxa" w:w="120"/>
+              <w:bottom w:type="dxa" w:w="80"/>
+              <w:right w:type="dxa" w:w="120"/>
+            </w:tcMar>
+          </w:tcPr>
+          <w:p>
+            <w:pPr>
+              <w:spacing w:after="0" w:before="0" w:line="276"/>
+            </w:pPr>
+            <w:r>
+              <w:rPr>
+                <w:rFonts w:ascii="Calibri" w:cs="Calibri" w:eastAsia="Calibri" w:hAnsi="Calibri"/>
+                <w:b w:val="false"/>
+                <w:bCs w:val="false"/>
+                <w:color w:val="1A1A2E"/>
+                <w:sz w:val="20"/>
+                <w:szCs w:val="20"/>
+              </w:rPr>
+              <w:t xml:space="preserve">Basic + bonuses − deductions</w:t>
+            </w:r>
+          </w:p>
+        </w:tc>
+        <w:tc>
+          <w:tcPr>
+            <w:tcBorders>
+              <w:top w:val="single" w:color="C5D5EA" w:sz="4"/>
+              <w:left w:val="single" w:color="C5D5EA" w:sz="4"/>
+              <w:bottom w:val="single" w:color="C5D5EA" w:sz="4"/>
+              <w:right w:val="single" w:color="C5D5EA" w:sz="4"/>
+            </w:tcBorders>
+            <w:shd w:fill="FFFFFF" w:val="clear"/>
+            <w:tcMar>
+              <w:top w:type="dxa" w:w="80"/>
+              <w:left w:type="dxa" w:w="120"/>
+              <w:bottom w:type="dxa" w:w="80"/>
+              <w:right w:type="dxa" w:w="120"/>
+            </w:tcMar>
+          </w:tcPr>
+          <w:p>
+            <w:pPr>
+              <w:spacing w:after="0" w:before="0" w:line="276"/>
+            </w:pPr>
+            <w:r>
+              <w:rPr>
+                <w:rFonts w:ascii="Calibri" w:cs="Calibri" w:eastAsia="Calibri" w:hAnsi="Calibri"/>
+                <w:b w:val="false"/>
+                <w:bCs w:val="false"/>
+                <w:color w:val="1A1A2E"/>
+                <w:sz w:val="20"/>
+                <w:szCs w:val="20"/>
+              </w:rPr>
+              <w:t xml:space="preserve">Basic + allowances + bonuses − deductions</w:t>
+            </w:r>
+          </w:p>
+        </w:tc>
+      </w:tr>
+    </w:tbl>
+    <w:p>
+      <w:pPr>
+        <w:spacing w:after="80" w:before="80" w:line="276"/>
+      </w:pPr>
+      <w:r>
+        <w:rPr>
+          <w:rFonts w:ascii="Calibri" w:cs="Calibri" w:eastAsia="Calibri" w:hAnsi="Calibri"/>
+          <w:sz w:val="22"/>
+          <w:szCs w:val="22"/>
+        </w:rPr>
+        <w:t xml:space="preserve"/>
+      </w:r>
+    </w:p>
+    <w:p>
+      <w:pPr>
+        <w:spacing w:after="100" w:before="0" w:line="276"/>
+      </w:pPr>
+      <w:r>
+        <w:rPr>
+          <w:rFonts w:ascii="Calibri" w:cs="Calibri" w:eastAsia="Calibri" w:hAnsi="Calibri"/>
+          <w:sz w:val="22"/>
+          <w:szCs w:val="22"/>
+        </w:rPr>
+        <w:t xml:space="preserve">Bonuses are </w:t>
+      </w:r>
+      <w:r>
+        <w:rPr>
+          <w:rFonts w:ascii="Calibri" w:cs="Calibri" w:eastAsia="Calibri" w:hAnsi="Calibri"/>
+          <w:b/>
+          <w:bCs/>
+          <w:sz w:val="22"/>
+          <w:szCs w:val="22"/>
+        </w:rPr>
+        <w:t xml:space="preserve">never</w:t>
+      </w:r>
+      <w:r>
+        <w:rPr>
+          <w:rFonts w:ascii="Calibri" w:cs="Calibri" w:eastAsia="Calibri" w:hAnsi="Calibri"/>
+          <w:sz w:val="22"/>
+          <w:szCs w:val="22"/>
+        </w:rPr>
+        <w:t xml:space="preserve"> in the pension base. They are variable performance payments, not contractual monthly emolument, and pension that moved with somebody's sales month could not be defended.</w:t>
+      </w:r>
+    </w:p>
+    <w:p>
+      <w:pPr>
+        <w:pBdr>
+          <w:left w:val="thick" w:color="FFC107" w:sz="12"/>
+        </w:pBdr>
+        <w:shd w:fill="FFF8E1" w:val="clear"/>
+        <w:spacing w:after="80" w:before="80" w:line="276"/>
+        <w:ind w:left="431" w:right="431"/>
+      </w:pPr>
+      <w:r>
+        <w:rPr>
+          <w:rFonts w:ascii="Calibri" w:cs="Calibri" w:eastAsia="Calibri" w:hAnsi="Calibri"/>
+          <w:i/>
+          <w:iCs/>
+          <w:color w:val="5D4037"/>
+          <w:sz w:val="22"/>
+          <w:szCs w:val="22"/>
+        </w:rPr>
+        <w:t xml:space="preserve">**Splitting an existing wage is safe.** If a staff member is currently on ₦200,000 recorded as basic and you restructure that into ₦120,000 basic + ₦50,000 housing + ₦30,000 transport, their take-home and their PAYE do not change — the tax base counts allowances too. What changes is that the pension is now computed correctly.</w:t>
+      </w:r>
+    </w:p>
+    <w:p>
+      <w:pPr>
+        <w:pStyle w:val="Heading4"/>
+        <w:spacing w:after="40" w:before="120" w:line="276"/>
+      </w:pPr>
+      <w:r>
+        <w:rPr>
+          <w:rFonts w:ascii="Calibri" w:cs="Calibri" w:eastAsia="Calibri" w:hAnsi="Calibri"/>
+          <w:b/>
+          <w:bCs/>
+          <w:i/>
+          <w:iCs/>
+          <w:color w:val="2d5a8e"/>
+          <w:sz w:val="24"/>
+          <w:szCs w:val="24"/>
+        </w:rPr>
+        <w:t xml:space="preserve">The remittance schedule</w:t>
+      </w:r>
+    </w:p>
+    <w:p>
+      <w:pPr>
+        <w:spacing w:after="100" w:before="0" w:line="276"/>
+      </w:pPr>
+      <w:r>
+        <w:rPr>
+          <w:rFonts w:ascii="Calibri" w:cs="Calibri" w:eastAsia="Calibri" w:hAnsi="Calibri"/>
+          <w:sz w:val="22"/>
+          <w:szCs w:val="22"/>
+        </w:rPr>
+        <w:t xml:space="preserve">Export the salary structure (</w:t>
+      </w:r>
+      <w:r>
+        <w:rPr>
+          <w:rFonts w:ascii="Calibri" w:cs="Calibri" w:eastAsia="Calibri" w:hAnsi="Calibri"/>
+          <w:b/>
+          <w:bCs/>
+          <w:sz w:val="22"/>
+          <w:szCs w:val="22"/>
+        </w:rPr>
+        <w:t xml:space="preserve">Export</w:t>
+      </w:r>
+      <w:r>
+        <w:rPr>
+          <w:rFonts w:ascii="Calibri" w:cs="Calibri" w:eastAsia="Calibri" w:hAnsi="Calibri"/>
+          <w:sz w:val="22"/>
+          <w:szCs w:val="22"/>
+        </w:rPr>
+        <w:t xml:space="preserve"> &gt; CSV) and it carries </w:t>
+      </w:r>
+      <w:r>
+        <w:rPr>
+          <w:rFonts w:ascii="Calibri" w:cs="Calibri" w:eastAsia="Calibri" w:hAnsi="Calibri"/>
+          <w:b/>
+          <w:bCs/>
+          <w:sz w:val="22"/>
+          <w:szCs w:val="22"/>
+        </w:rPr>
+        <w:t xml:space="preserve">Total Allowances</w:t>
+      </w:r>
+      <w:r>
+        <w:rPr>
+          <w:rFonts w:ascii="Calibri" w:cs="Calibri" w:eastAsia="Calibri" w:hAnsi="Calibri"/>
+          <w:sz w:val="22"/>
+          <w:szCs w:val="22"/>
+        </w:rPr>
+        <w:t xml:space="preserve">, </w:t>
+      </w:r>
+      <w:r>
+        <w:rPr>
+          <w:rFonts w:ascii="Calibri" w:cs="Calibri" w:eastAsia="Calibri" w:hAnsi="Calibri"/>
+          <w:b/>
+          <w:bCs/>
+          <w:sz w:val="22"/>
+          <w:szCs w:val="22"/>
+        </w:rPr>
+        <w:t xml:space="preserve">Pensionable Allowances</w:t>
+      </w:r>
+      <w:r>
+        <w:rPr>
+          <w:rFonts w:ascii="Calibri" w:cs="Calibri" w:eastAsia="Calibri" w:hAnsi="Calibri"/>
+          <w:sz w:val="22"/>
+          <w:szCs w:val="22"/>
+        </w:rPr>
+        <w:t xml:space="preserve"> and </w:t>
+      </w:r>
+      <w:r>
+        <w:rPr>
+          <w:rFonts w:ascii="Calibri" w:cs="Calibri" w:eastAsia="Calibri" w:hAnsi="Calibri"/>
+          <w:b/>
+          <w:bCs/>
+          <w:sz w:val="22"/>
+          <w:szCs w:val="22"/>
+        </w:rPr>
+        <w:t xml:space="preserve">Pensionable Earnings</w:t>
+      </w:r>
+      <w:r>
+        <w:rPr>
+          <w:rFonts w:ascii="Calibri" w:cs="Calibri" w:eastAsia="Calibri" w:hAnsi="Calibri"/>
+          <w:sz w:val="22"/>
+          <w:szCs w:val="22"/>
+        </w:rPr>
+        <w:t xml:space="preserve"> as named columns, so the file doubles as the schedule your PFA needs — it shows the emolument each 8% and 10% was struck on.</w:t>
+      </w:r>
+    </w:p>
+    <w:p>
+      <w:pPr>
+        <w:pStyle w:val="Heading4"/>
+        <w:spacing w:after="40" w:before="120" w:line="276"/>
+      </w:pPr>
+      <w:r>
+        <w:rPr>
+          <w:rFonts w:ascii="Calibri" w:cs="Calibri" w:eastAsia="Calibri" w:hAnsi="Calibri"/>
+          <w:b/>
+          <w:bCs/>
+          <w:i/>
+          <w:iCs/>
+          <w:color w:val="2d5a8e"/>
+          <w:sz w:val="24"/>
+          <w:szCs w:val="24"/>
+        </w:rPr>
+        <w:t xml:space="preserve">Who can do what</w:t>
+      </w:r>
+    </w:p>
+    <w:p>
+      <w:pPr>
+        <w:spacing w:after="80" w:before="80" w:line="276"/>
+      </w:pPr>
+      <w:r>
+        <w:rPr>
+          <w:rFonts w:ascii="Calibri" w:cs="Calibri" w:eastAsia="Calibri" w:hAnsi="Calibri"/>
+          <w:sz w:val="22"/>
+          <w:szCs w:val="22"/>
+        </w:rPr>
+        <w:t xml:space="preserve"/>
+      </w:r>
+    </w:p>
+    <w:tbl>
+      <w:tblPr>
+        <w:tblW w:type="pct" w:w="100%"/>
+        <w:tblBorders>
+          <w:top w:val="single" w:color="auto" w:sz="4"/>
+          <w:left w:val="single" w:color="auto" w:sz="4"/>
+          <w:bottom w:val="single" w:color="auto" w:sz="4"/>
+          <w:right w:val="single" w:color="auto" w:sz="4"/>
+          <w:insideH w:val="single" w:color="auto" w:sz="4"/>
+          <w:insideV w:val="single" w:color="auto" w:sz="4"/>
+        </w:tblBorders>
+        <w:tblCellMar>
+          <w:top w:type="dxa" w:w="0"/>
+          <w:bottom w:type="dxa" w:w="0"/>
+        </w:tblCellMar>
+      </w:tblPr>
+      <w:tblGrid>
+        <w:gridCol w:w="100"/>
+        <w:gridCol w:w="100"/>
+      </w:tblGrid>
+      <w:tr>
+        <w:trPr>
+          <w:tblHeader/>
+        </w:trPr>
+        <w:tc>
+          <w:tcPr>
+            <w:tcBorders>
+              <w:top w:val="single" w:color="1a71f6" w:sz="4"/>
+              <w:left w:val="single" w:color="1a71f6" w:sz="4"/>
+              <w:bottom w:val="single" w:color="1a71f6" w:sz="4"/>
+              <w:right w:val="single" w:color="1a71f6" w:sz="4"/>
+            </w:tcBorders>
+            <w:shd w:fill="1a71f6" w:val="clear"/>
+            <w:tcMar>
+              <w:top w:type="dxa" w:w="80"/>
+              <w:left w:type="dxa" w:w="120"/>
+              <w:bottom w:type="dxa" w:w="80"/>
+              <w:right w:type="dxa" w:w="120"/>
+            </w:tcMar>
+          </w:tcPr>
+          <w:p>
+            <w:pPr>
+              <w:spacing w:after="0" w:before="0" w:line="276"/>
+            </w:pPr>
+            <w:r>
+              <w:rPr>
+                <w:rFonts w:ascii="Calibri" w:cs="Calibri" w:eastAsia="Calibri" w:hAnsi="Calibri"/>
+                <w:b/>
+                <w:bCs/>
+                <w:color w:val="FFFFFF"/>
+                <w:sz w:val="20"/>
+                <w:szCs w:val="20"/>
+              </w:rPr>
+              <w:t xml:space="preserve">Who</w:t>
+            </w:r>
+          </w:p>
+        </w:tc>
+        <w:tc>
+          <w:tcPr>
+            <w:tcBorders>
+              <w:top w:val="single" w:color="1a71f6" w:sz="4"/>
+              <w:left w:val="single" w:color="1a71f6" w:sz="4"/>
+              <w:bottom w:val="single" w:color="1a71f6" w:sz="4"/>
+              <w:right w:val="single" w:color="1a71f6" w:sz="4"/>
+            </w:tcBorders>
+            <w:shd w:fill="1a71f6" w:val="clear"/>
+            <w:tcMar>
+              <w:top w:type="dxa" w:w="80"/>
+              <w:left w:type="dxa" w:w="120"/>
+              <w:bottom w:type="dxa" w:w="80"/>
+              <w:right w:type="dxa" w:w="120"/>
+            </w:tcMar>
+          </w:tcPr>
+          <w:p>
+            <w:pPr>
+              <w:spacing w:after="0" w:before="0" w:line="276"/>
+            </w:pPr>
+            <w:r>
+              <w:rPr>
+                <w:rFonts w:ascii="Calibri" w:cs="Calibri" w:eastAsia="Calibri" w:hAnsi="Calibri"/>
+                <w:b/>
+                <w:bCs/>
+                <w:color w:val="FFFFFF"/>
+                <w:sz w:val="20"/>
+                <w:szCs w:val="20"/>
+              </w:rPr>
+              <w:t xml:space="preserve">What they can do</w:t>
+            </w:r>
+          </w:p>
+        </w:tc>
+      </w:tr>
+      <w:tr>
+        <w:tc>
+          <w:tcPr>
+            <w:tcBorders>
+              <w:top w:val="single" w:color="C5D5EA" w:sz="4"/>
+              <w:left w:val="single" w:color="C5D5EA" w:sz="4"/>
+              <w:bottom w:val="single" w:color="C5D5EA" w:sz="4"/>
+              <w:right w:val="single" w:color="C5D5EA" w:sz="4"/>
+            </w:tcBorders>
+            <w:shd w:fill="FFFFFF" w:val="clear"/>
+            <w:tcMar>
+              <w:top w:type="dxa" w:w="80"/>
+              <w:left w:type="dxa" w:w="120"/>
+              <w:bottom w:type="dxa" w:w="80"/>
+              <w:right w:type="dxa" w:w="120"/>
+            </w:tcMar>
+          </w:tcPr>
+          <w:p>
+            <w:pPr>
+              <w:spacing w:after="0" w:before="0" w:line="276"/>
+            </w:pPr>
+            <w:r>
+              <w:rPr>
+                <w:rFonts w:ascii="Calibri" w:cs="Calibri" w:eastAsia="Calibri" w:hAnsi="Calibri"/>
+                <w:b w:val="false"/>
+                <w:bCs w:val="false"/>
+                <w:color w:val="1A1A2E"/>
+                <w:sz w:val="20"/>
+                <w:szCs w:val="20"/>
+              </w:rPr>
+              <w:t xml:space="preserve">**Accountant**</w:t>
+            </w:r>
+          </w:p>
+        </w:tc>
+        <w:tc>
+          <w:tcPr>
+            <w:tcBorders>
+              <w:top w:val="single" w:color="C5D5EA" w:sz="4"/>
+              <w:left w:val="single" w:color="C5D5EA" w:sz="4"/>
+              <w:bottom w:val="single" w:color="C5D5EA" w:sz="4"/>
+              <w:right w:val="single" w:color="C5D5EA" w:sz="4"/>
+            </w:tcBorders>
+            <w:shd w:fill="FFFFFF" w:val="clear"/>
+            <w:tcMar>
+              <w:top w:type="dxa" w:w="80"/>
+              <w:left w:type="dxa" w:w="120"/>
+              <w:bottom w:type="dxa" w:w="80"/>
+              <w:right w:type="dxa" w:w="120"/>
+            </w:tcMar>
+          </w:tcPr>
+          <w:p>
+            <w:pPr>
+              <w:spacing w:after="0" w:before="0" w:line="276"/>
+            </w:pPr>
+            <w:r>
+              <w:rPr>
+                <w:rFonts w:ascii="Calibri" w:cs="Calibri" w:eastAsia="Calibri" w:hAnsi="Calibri"/>
+                <w:b w:val="false"/>
+                <w:bCs w:val="false"/>
+                <w:color w:val="1A1A2E"/>
+                <w:sz w:val="20"/>
+                <w:szCs w:val="20"/>
+              </w:rPr>
+              <w:t xml:space="preserve">Maintain the catalogue; enter allowances for any staff member except managers</w:t>
+            </w:r>
+          </w:p>
+        </w:tc>
+      </w:tr>
+      <w:tr>
+        <w:tc>
+          <w:tcPr>
+            <w:tcBorders>
+              <w:top w:val="single" w:color="C5D5EA" w:sz="4"/>
+              <w:left w:val="single" w:color="C5D5EA" w:sz="4"/>
+              <w:bottom w:val="single" w:color="C5D5EA" w:sz="4"/>
+              <w:right w:val="single" w:color="C5D5EA" w:sz="4"/>
+            </w:tcBorders>
+            <w:shd w:fill="EEF4FF" w:val="clear"/>
+            <w:tcMar>
+              <w:top w:type="dxa" w:w="80"/>
+              <w:left w:type="dxa" w:w="120"/>
+              <w:bottom w:type="dxa" w:w="80"/>
+              <w:right w:type="dxa" w:w="120"/>
+            </w:tcMar>
+          </w:tcPr>
+          <w:p>
+            <w:pPr>
+              <w:spacing w:after="0" w:before="0" w:line="276"/>
+            </w:pPr>
+            <w:r>
+              <w:rPr>
+                <w:rFonts w:ascii="Calibri" w:cs="Calibri" w:eastAsia="Calibri" w:hAnsi="Calibri"/>
+                <w:b w:val="false"/>
+                <w:bCs w:val="false"/>
+                <w:color w:val="1A1A2E"/>
+                <w:sz w:val="20"/>
+                <w:szCs w:val="20"/>
+              </w:rPr>
+              <w:t xml:space="preserve">**Owner**</w:t>
+            </w:r>
+          </w:p>
+        </w:tc>
+        <w:tc>
+          <w:tcPr>
+            <w:tcBorders>
+              <w:top w:val="single" w:color="C5D5EA" w:sz="4"/>
+              <w:left w:val="single" w:color="C5D5EA" w:sz="4"/>
+              <w:bottom w:val="single" w:color="C5D5EA" w:sz="4"/>
+              <w:right w:val="single" w:color="C5D5EA" w:sz="4"/>
+            </w:tcBorders>
+            <w:shd w:fill="EEF4FF" w:val="clear"/>
+            <w:tcMar>
+              <w:top w:type="dxa" w:w="80"/>
+              <w:left w:type="dxa" w:w="120"/>
+              <w:bottom w:type="dxa" w:w="80"/>
+              <w:right w:type="dxa" w:w="120"/>
+            </w:tcMar>
+          </w:tcPr>
+          <w:p>
+            <w:pPr>
+              <w:spacing w:after="0" w:before="0" w:line="276"/>
+            </w:pPr>
+            <w:r>
+              <w:rPr>
+                <w:rFonts w:ascii="Calibri" w:cs="Calibri" w:eastAsia="Calibri" w:hAnsi="Calibri"/>
+                <w:b w:val="false"/>
+                <w:bCs w:val="false"/>
+                <w:color w:val="1A1A2E"/>
+                <w:sz w:val="20"/>
+                <w:szCs w:val="20"/>
+              </w:rPr>
+              <w:t xml:space="preserve">Everything the accountant can, plus managers' allowances</w:t>
+            </w:r>
+          </w:p>
+        </w:tc>
+      </w:tr>
+      <w:tr>
+        <w:tc>
+          <w:tcPr>
+            <w:tcBorders>
+              <w:top w:val="single" w:color="C5D5EA" w:sz="4"/>
+              <w:left w:val="single" w:color="C5D5EA" w:sz="4"/>
+              <w:bottom w:val="single" w:color="C5D5EA" w:sz="4"/>
+              <w:right w:val="single" w:color="C5D5EA" w:sz="4"/>
+            </w:tcBorders>
+            <w:shd w:fill="FFFFFF" w:val="clear"/>
+            <w:tcMar>
+              <w:top w:type="dxa" w:w="80"/>
+              <w:left w:type="dxa" w:w="120"/>
+              <w:bottom w:type="dxa" w:w="80"/>
+              <w:right w:type="dxa" w:w="120"/>
+            </w:tcMar>
+          </w:tcPr>
+          <w:p>
+            <w:pPr>
+              <w:spacing w:after="0" w:before="0" w:line="276"/>
+            </w:pPr>
+            <w:r>
+              <w:rPr>
+                <w:rFonts w:ascii="Calibri" w:cs="Calibri" w:eastAsia="Calibri" w:hAnsi="Calibri"/>
+                <w:b w:val="false"/>
+                <w:bCs w:val="false"/>
+                <w:color w:val="1A1A2E"/>
+                <w:sz w:val="20"/>
+                <w:szCs w:val="20"/>
+              </w:rPr>
+              <w:t xml:space="preserve">**Hired manager**</w:t>
+            </w:r>
+          </w:p>
+        </w:tc>
+        <w:tc>
+          <w:tcPr>
+            <w:tcBorders>
+              <w:top w:val="single" w:color="C5D5EA" w:sz="4"/>
+              <w:left w:val="single" w:color="C5D5EA" w:sz="4"/>
+              <w:bottom w:val="single" w:color="C5D5EA" w:sz="4"/>
+              <w:right w:val="single" w:color="C5D5EA" w:sz="4"/>
+            </w:tcBorders>
+            <w:shd w:fill="FFFFFF" w:val="clear"/>
+            <w:tcMar>
+              <w:top w:type="dxa" w:w="80"/>
+              <w:left w:type="dxa" w:w="120"/>
+              <w:bottom w:type="dxa" w:w="80"/>
+              <w:right w:type="dxa" w:w="120"/>
+            </w:tcMar>
+          </w:tcPr>
+          <w:p>
+            <w:pPr>
+              <w:spacing w:after="0" w:before="0" w:line="276"/>
+            </w:pPr>
+            <w:r>
+              <w:rPr>
+                <w:rFonts w:ascii="Calibri" w:cs="Calibri" w:eastAsia="Calibri" w:hAnsi="Calibri"/>
+                <w:b w:val="false"/>
+                <w:bCs w:val="false"/>
+                <w:color w:val="1A1A2E"/>
+                <w:sz w:val="20"/>
+                <w:szCs w:val="20"/>
+              </w:rPr>
+              <w:t xml:space="preserve">Nothing — a manager's own pay is the owner's decision</w:t>
+            </w:r>
+          </w:p>
+        </w:tc>
+      </w:tr>
+      <w:tr>
+        <w:tc>
+          <w:tcPr>
+            <w:tcBorders>
+              <w:top w:val="single" w:color="C5D5EA" w:sz="4"/>
+              <w:left w:val="single" w:color="C5D5EA" w:sz="4"/>
+              <w:bottom w:val="single" w:color="C5D5EA" w:sz="4"/>
+              <w:right w:val="single" w:color="C5D5EA" w:sz="4"/>
+            </w:tcBorders>
+            <w:shd w:fill="EEF4FF" w:val="clear"/>
+            <w:tcMar>
+              <w:top w:type="dxa" w:w="80"/>
+              <w:left w:type="dxa" w:w="120"/>
+              <w:bottom w:type="dxa" w:w="80"/>
+              <w:right w:type="dxa" w:w="120"/>
+            </w:tcMar>
+          </w:tcPr>
+          <w:p>
+            <w:pPr>
+              <w:spacing w:after="0" w:before="0" w:line="276"/>
+            </w:pPr>
+            <w:r>
+              <w:rPr>
+                <w:rFonts w:ascii="Calibri" w:cs="Calibri" w:eastAsia="Calibri" w:hAnsi="Calibri"/>
+                <w:b w:val="false"/>
+                <w:bCs w:val="false"/>
+                <w:color w:val="1A1A2E"/>
+                <w:sz w:val="20"/>
+                <w:szCs w:val="20"/>
+              </w:rPr>
+              <w:t xml:space="preserve">Everyone else</w:t>
+            </w:r>
+          </w:p>
+        </w:tc>
+        <w:tc>
+          <w:tcPr>
+            <w:tcBorders>
+              <w:top w:val="single" w:color="C5D5EA" w:sz="4"/>
+              <w:left w:val="single" w:color="C5D5EA" w:sz="4"/>
+              <w:bottom w:val="single" w:color="C5D5EA" w:sz="4"/>
+              <w:right w:val="single" w:color="C5D5EA" w:sz="4"/>
+            </w:tcBorders>
+            <w:shd w:fill="EEF4FF" w:val="clear"/>
+            <w:tcMar>
+              <w:top w:type="dxa" w:w="80"/>
+              <w:left w:type="dxa" w:w="120"/>
+              <w:bottom w:type="dxa" w:w="80"/>
+              <w:right w:type="dxa" w:w="120"/>
+            </w:tcMar>
+          </w:tcPr>
+          <w:p>
+            <w:pPr>
+              <w:spacing w:after="0" w:before="0" w:line="276"/>
+            </w:pPr>
+            <w:r>
+              <w:rPr>
+                <w:rFonts w:ascii="Calibri" w:cs="Calibri" w:eastAsia="Calibri" w:hAnsi="Calibri"/>
+                <w:b w:val="false"/>
+                <w:bCs w:val="false"/>
+                <w:color w:val="1A1A2E"/>
+                <w:sz w:val="20"/>
+                <w:szCs w:val="20"/>
+              </w:rPr>
+              <w:t xml:space="preserve">No access</w:t>
+            </w:r>
+          </w:p>
+        </w:tc>
+      </w:tr>
+    </w:tbl>
+    <w:p>
+      <w:pPr>
+        <w:spacing w:after="80" w:before="80" w:line="276"/>
+      </w:pPr>
+      <w:r>
+        <w:rPr>
+          <w:rFonts w:ascii="Calibri" w:cs="Calibri" w:eastAsia="Calibri" w:hAnsi="Calibri"/>
+          <w:sz w:val="22"/>
+          <w:szCs w:val="22"/>
+        </w:rPr>
+        <w:t xml:space="preserve"/>
       </w:r>
     </w:p>
     <w:p>
@@ -21109,7 +22408,290 @@
           <w:sz w:val="26"/>
           <w:szCs w:val="26"/>
         </w:rPr>
-        <w:t xml:space="preserve">14.3 Consolidated Payroll (Multi-Branch)</w:t>
+        <w:t xml:space="preserve">14.3 Commission Structures</w:t>
+      </w:r>
+    </w:p>
+    <w:p>
+      <w:pPr>
+        <w:spacing w:after="100" w:before="0" w:line="276"/>
+      </w:pPr>
+      <w:r>
+        <w:rPr>
+          <w:rFonts w:ascii="Calibri" w:cs="Calibri" w:eastAsia="Calibri" w:hAnsi="Calibri"/>
+          <w:sz w:val="22"/>
+          <w:szCs w:val="22"/>
+        </w:rPr>
+        <w:t xml:space="preserve">Commissions reward staff for sales performance.</w:t>
+      </w:r>
+    </w:p>
+    <w:p>
+      <w:pPr>
+        <w:spacing w:after="100" w:before="0" w:line="276"/>
+      </w:pPr>
+      <w:r>
+        <w:rPr>
+          <w:rFonts w:ascii="Calibri" w:cs="Calibri" w:eastAsia="Calibri" w:hAnsi="Calibri"/>
+          <w:b/>
+          <w:bCs/>
+          <w:sz w:val="22"/>
+          <w:szCs w:val="22"/>
+        </w:rPr>
+        <w:t xml:space="preserve">Setting Up a Commission Structure:</w:t>
+      </w:r>
+    </w:p>
+    <w:p>
+      <w:pPr>
+        <w:pBdr>
+          <w:left w:val="thick" w:color="FFC107" w:sz="12"/>
+        </w:pBdr>
+        <w:shd w:fill="FFF8E1" w:val="clear"/>
+        <w:spacing w:after="80" w:before="80" w:line="276"/>
+        <w:ind w:left="431" w:right="431"/>
+      </w:pPr>
+      <w:r>
+        <w:rPr>
+          <w:rFonts w:ascii="Calibri" w:cs="Calibri" w:eastAsia="Calibri" w:hAnsi="Calibri"/>
+          <w:i/>
+          <w:iCs/>
+          <w:color w:val="5D4037"/>
+          <w:sz w:val="22"/>
+          <w:szCs w:val="22"/>
+        </w:rPr>
+        <w:t xml:space="preserve">Done by the Manager</w:t>
+      </w:r>
+    </w:p>
+    <w:p>
+      <w:pPr>
+        <w:pStyle w:val="ListParagraph"/>
+        <w:numPr>
+          <w:ilvl w:val="0"/>
+          <w:numId w:val="2"/>
+        </w:numPr>
+        <w:spacing w:after="60" w:before="0" w:line="276"/>
+      </w:pPr>
+      <w:r>
+        <w:rPr>
+          <w:rFonts w:ascii="Calibri" w:cs="Calibri" w:eastAsia="Calibri" w:hAnsi="Calibri"/>
+          <w:sz w:val="22"/>
+          <w:szCs w:val="22"/>
+        </w:rPr>
+        <w:t xml:space="preserve">Go to </w:t>
+      </w:r>
+      <w:r>
+        <w:rPr>
+          <w:rFonts w:ascii="Calibri" w:cs="Calibri" w:eastAsia="Calibri" w:hAnsi="Calibri"/>
+          <w:b/>
+          <w:bCs/>
+          <w:sz w:val="22"/>
+          <w:szCs w:val="22"/>
+        </w:rPr>
+        <w:t xml:space="preserve">Commissions</w:t>
+      </w:r>
+      <w:r>
+        <w:rPr>
+          <w:rFonts w:ascii="Calibri" w:cs="Calibri" w:eastAsia="Calibri" w:hAnsi="Calibri"/>
+          <w:sz w:val="22"/>
+          <w:szCs w:val="22"/>
+        </w:rPr>
+        <w:t xml:space="preserve"> &gt; </w:t>
+      </w:r>
+      <w:r>
+        <w:rPr>
+          <w:rFonts w:ascii="Calibri" w:cs="Calibri" w:eastAsia="Calibri" w:hAnsi="Calibri"/>
+          <w:b/>
+          <w:bCs/>
+          <w:sz w:val="22"/>
+          <w:szCs w:val="22"/>
+        </w:rPr>
+        <w:t xml:space="preserve">Structure</w:t>
+      </w:r>
+    </w:p>
+    <w:p>
+      <w:pPr>
+        <w:pStyle w:val="ListParagraph"/>
+        <w:numPr>
+          <w:ilvl w:val="0"/>
+          <w:numId w:val="2"/>
+        </w:numPr>
+        <w:spacing w:after="60" w:before="0" w:line="276"/>
+      </w:pPr>
+      <w:r>
+        <w:rPr>
+          <w:rFonts w:ascii="Calibri" w:cs="Calibri" w:eastAsia="Calibri" w:hAnsi="Calibri"/>
+          <w:sz w:val="22"/>
+          <w:szCs w:val="22"/>
+        </w:rPr>
+        <w:t xml:space="preserve">Click </w:t>
+      </w:r>
+      <w:r>
+        <w:rPr>
+          <w:rFonts w:ascii="Calibri" w:cs="Calibri" w:eastAsia="Calibri" w:hAnsi="Calibri"/>
+          <w:b/>
+          <w:bCs/>
+          <w:sz w:val="22"/>
+          <w:szCs w:val="22"/>
+        </w:rPr>
+        <w:t xml:space="preserve">Add Commission Rule</w:t>
+      </w:r>
+    </w:p>
+    <w:p>
+      <w:pPr>
+        <w:pStyle w:val="ListParagraph"/>
+        <w:numPr>
+          <w:ilvl w:val="0"/>
+          <w:numId w:val="2"/>
+        </w:numPr>
+        <w:spacing w:after="60" w:before="0" w:line="276"/>
+      </w:pPr>
+      <w:r>
+        <w:rPr>
+          <w:rFonts w:ascii="Calibri" w:cs="Calibri" w:eastAsia="Calibri" w:hAnsi="Calibri"/>
+          <w:sz w:val="22"/>
+          <w:szCs w:val="22"/>
+        </w:rPr>
+        <w:t xml:space="preserve">Choose the product type and the commission rate (percentage or fixed amount per litre/unit)</w:t>
+      </w:r>
+    </w:p>
+    <w:p>
+      <w:pPr>
+        <w:pStyle w:val="ListParagraph"/>
+        <w:numPr>
+          <w:ilvl w:val="0"/>
+          <w:numId w:val="2"/>
+        </w:numPr>
+        <w:spacing w:after="60" w:before="0" w:line="276"/>
+      </w:pPr>
+      <w:r>
+        <w:rPr>
+          <w:rFonts w:ascii="Calibri" w:cs="Calibri" w:eastAsia="Calibri" w:hAnsi="Calibri"/>
+          <w:sz w:val="22"/>
+          <w:szCs w:val="22"/>
+        </w:rPr>
+        <w:t xml:space="preserve">Set eligibility (which roles qualify)</w:t>
+      </w:r>
+    </w:p>
+    <w:p>
+      <w:pPr>
+        <w:pStyle w:val="ListParagraph"/>
+        <w:numPr>
+          <w:ilvl w:val="0"/>
+          <w:numId w:val="2"/>
+        </w:numPr>
+        <w:spacing w:after="60" w:before="0" w:line="276"/>
+      </w:pPr>
+      <w:r>
+        <w:rPr>
+          <w:rFonts w:ascii="Calibri" w:cs="Calibri" w:eastAsia="Calibri" w:hAnsi="Calibri"/>
+          <w:sz w:val="22"/>
+          <w:szCs w:val="22"/>
+        </w:rPr>
+        <w:t xml:space="preserve">Click </w:t>
+      </w:r>
+      <w:r>
+        <w:rPr>
+          <w:rFonts w:ascii="Calibri" w:cs="Calibri" w:eastAsia="Calibri" w:hAnsi="Calibri"/>
+          <w:b/>
+          <w:bCs/>
+          <w:sz w:val="22"/>
+          <w:szCs w:val="22"/>
+        </w:rPr>
+        <w:t xml:space="preserve">Save</w:t>
+      </w:r>
+    </w:p>
+    <w:p>
+      <w:pPr>
+        <w:spacing w:after="100" w:before="0" w:line="276"/>
+      </w:pPr>
+      <w:r>
+        <w:rPr>
+          <w:rFonts w:ascii="Calibri" w:cs="Calibri" w:eastAsia="Calibri" w:hAnsi="Calibri"/>
+          <w:b/>
+          <w:bCs/>
+          <w:sz w:val="22"/>
+          <w:szCs w:val="22"/>
+        </w:rPr>
+        <w:t xml:space="preserve">Viewing Commission Payments:</w:t>
+      </w:r>
+    </w:p>
+    <w:p>
+      <w:pPr>
+        <w:pStyle w:val="ListParagraph"/>
+        <w:numPr>
+          <w:ilvl w:val="0"/>
+          <w:numId w:val="2"/>
+        </w:numPr>
+        <w:spacing w:after="60" w:before="0" w:line="276"/>
+      </w:pPr>
+      <w:r>
+        <w:rPr>
+          <w:rFonts w:ascii="Calibri" w:cs="Calibri" w:eastAsia="Calibri" w:hAnsi="Calibri"/>
+          <w:sz w:val="22"/>
+          <w:szCs w:val="22"/>
+        </w:rPr>
+        <w:t xml:space="preserve">Go to </w:t>
+      </w:r>
+      <w:r>
+        <w:rPr>
+          <w:rFonts w:ascii="Calibri" w:cs="Calibri" w:eastAsia="Calibri" w:hAnsi="Calibri"/>
+          <w:b/>
+          <w:bCs/>
+          <w:sz w:val="22"/>
+          <w:szCs w:val="22"/>
+        </w:rPr>
+        <w:t xml:space="preserve">Commissions</w:t>
+      </w:r>
+      <w:r>
+        <w:rPr>
+          <w:rFonts w:ascii="Calibri" w:cs="Calibri" w:eastAsia="Calibri" w:hAnsi="Calibri"/>
+          <w:sz w:val="22"/>
+          <w:szCs w:val="22"/>
+        </w:rPr>
+        <w:t xml:space="preserve"> &gt; </w:t>
+      </w:r>
+      <w:r>
+        <w:rPr>
+          <w:rFonts w:ascii="Calibri" w:cs="Calibri" w:eastAsia="Calibri" w:hAnsi="Calibri"/>
+          <w:b/>
+          <w:bCs/>
+          <w:sz w:val="22"/>
+          <w:szCs w:val="22"/>
+        </w:rPr>
+        <w:t xml:space="preserve">Payment History</w:t>
+      </w:r>
+    </w:p>
+    <w:p>
+      <w:pPr>
+        <w:pStyle w:val="ListParagraph"/>
+        <w:numPr>
+          <w:ilvl w:val="0"/>
+          <w:numId w:val="2"/>
+        </w:numPr>
+        <w:spacing w:after="60" w:before="0" w:line="276"/>
+      </w:pPr>
+      <w:r>
+        <w:rPr>
+          <w:rFonts w:ascii="Calibri" w:cs="Calibri" w:eastAsia="Calibri" w:hAnsi="Calibri"/>
+          <w:sz w:val="22"/>
+          <w:szCs w:val="22"/>
+        </w:rPr>
+        <w:t xml:space="preserve">See earned commissions by staff member and period</w:t>
+      </w:r>
+    </w:p>
+    <w:p>
+      <w:pPr>
+        <w:pStyle w:val="Heading3"/>
+        <w:spacing w:after="60" w:before="160" w:line="276"/>
+      </w:pPr>
+      <w:r>
+        <w:rPr>
+          <w:rFonts w:ascii="Calibri" w:cs="Calibri" w:eastAsia="Calibri" w:hAnsi="Calibri"/>
+          <w:b/>
+          <w:bCs/>
+          <w:color w:val="2d5a8e"/>
+          <w:sz w:val="26"/>
+          <w:szCs w:val="26"/>
+        </w:rPr>
+        <w:t xml:space="preserve">14.4 Consolidated Payroll (Multi-Branch)</w:t>
       </w:r>
     </w:p>
     <w:p>

</xml_diff>